<commit_message>
docs: update architecture diagrams, README, TODO and build configs
</commit_message>
<xml_diff>
--- a/docs/Bao_cao_Project2_fixed_headings_v4.docx
+++ b/docs/Bao_cao_Project2_fixed_headings_v4.docx
@@ -988,17 +988,419 @@
     </w:p>
     <w:p>
       <w:pPr>
-        <w:tabs>
-          <w:tab w:val="right" w:leader="dot" w:pos="8787"/>
-        </w:tabs>
+        <w:pStyle w:val="Heading1"/>
+      </w:pPr>
+      <w:r>
+        <w:lastRenderedPageBreak/>
+        <w:t>MỞ ĐẦU</w:t>
+      </w:r>
+    </w:p>
+    <w:p>
+      <w:pPr>
+        <w:pStyle w:val="Heading2"/>
+      </w:pPr>
+      <w:r>
+        <w:rPr>
+          <w:rFonts w:eastAsia="Arial"/>
+        </w:rPr>
+        <w:t xml:space="preserve"> Lý do chọn đề tài</w:t>
+      </w:r>
+    </w:p>
+    <w:p>
+      <w:pPr>
+        <w:spacing w:after="80" w:line="324" w:lineRule="auto"/>
+        <w:ind w:firstLine="510"/>
+        <w:jc w:val="both"/>
+      </w:pPr>
+      <w:r>
+        <w:t>Máy tính hiện đại được tổ chức thành nhiều tầng trừu tượng: phần cứng, hệ điều hành, trình biên dịch, thư viện, chương trình và giao diện người dùng. Tuy nhiên, giữa ngôn ngữ nguồn và tầng thực thi luôn tồn tại một khoảng cách nhận thức đáng kể. Nhiều lỗi hệ thống, lỗ hổng bảo mật hoặc hành vi bất thường chỉ bộc lộ rõ khi quan sát chương trình ở mức mã máy.</w:t>
+      </w:r>
+    </w:p>
+    <w:p>
+      <w:pPr>
+        <w:spacing w:after="80" w:line="324" w:lineRule="auto"/>
+        <w:ind w:firstLine="510"/>
+        <w:jc w:val="both"/>
+      </w:pPr>
+      <w:r>
+        <w:t>Từ góc độ an ninh và phân tích nhị phân, disassembler là công cụ nền tảng trong ba bối cảnh tiêu biểu: phân tích mã độc, nghiên cứu lỗ hổng bảo mật và pháp y kỹ thuật số. Trong các tình huống này, đối tượng phân tích thường chỉ tồn tại dưới dạng file thực thi hoặc object file; vì vậy cần một công cụ có khả năng đọc, giải mã và tái hiện dòng lệnh hợp ngữ để phục vụ việc lập luận kỹ thuật.</w:t>
+      </w:r>
+    </w:p>
+    <w:p>
+      <w:pPr>
         <w:spacing w:after="60" w:line="324" w:lineRule="auto"/>
-      </w:pPr>
-      <w:r>
-        <w:rPr>
-          <w:b/>
+        <w:ind w:left="454" w:hanging="227"/>
+        <w:jc w:val="both"/>
+      </w:pPr>
+      <w:r>
+        <w:t>• Phân tích mã độc: hỗ trợ bóc tách các mẫu chương trình độc hại không có mã nguồn, từ đó xác định hành vi, luồng điều khiển và dấu hiệu né tránh phân tích.</w:t>
+      </w:r>
+    </w:p>
+    <w:p>
+      <w:pPr>
+        <w:spacing w:after="60" w:line="324" w:lineRule="auto"/>
+        <w:ind w:left="454" w:hanging="227"/>
+        <w:jc w:val="both"/>
+      </w:pPr>
+      <w:r>
+        <w:t>• Nghiên cứu lỗ hổng bảo mật: cho phép kiểm tra các đoạn mã nhị phân của thư viện, firmware hoặc ứng dụng đóng để phát hiện logic xử lý nguy hiểm.</w:t>
+      </w:r>
+    </w:p>
+    <w:p>
+      <w:pPr>
+        <w:spacing w:after="60" w:line="324" w:lineRule="auto"/>
+        <w:ind w:left="454" w:hanging="227"/>
+        <w:jc w:val="both"/>
+      </w:pPr>
+      <w:r>
+        <w:t>• Pháp y kỹ thuật số: hỗ trợ trích xuất bằng chứng từ phần mềm thu giữ được trong quá trình điều tra, nhất là khi tác giả phần mềm không cung cấp thông tin triển khai.</w:t>
+      </w:r>
+    </w:p>
+    <w:p>
+      <w:pPr>
+        <w:spacing w:after="80" w:line="324" w:lineRule="auto"/>
+        <w:ind w:firstLine="510"/>
+        <w:jc w:val="both"/>
+      </w:pPr>
+      <w:r>
+        <w:t>Mặc dù GNU objdump và nhiều công cụ mature khác đã hỗ trợ disassembly cho RISC-V, chúng thường được thiết kế theo hướng đa kiến trúc, đa định dạng và ưu tiên đầu ra văn bản cho người đọc. Đồ án này lựa chọn cách tiếp cận tối giản hơn: xây dựng một lõi chuyên biệt cho RV32I, tập trung vào tính đúng đắn của parser, resolver, decoder và mô hình dữ liệu đầu ra để phục vụ học tập cũng như nghiên cứu sâu hơn.</w:t>
+      </w:r>
+    </w:p>
+    <w:p>
+      <w:pPr>
+        <w:pStyle w:val="Heading2"/>
+      </w:pPr>
+      <w:r>
+        <w:rPr>
+          <w:rFonts w:eastAsia="Arial"/>
+        </w:rPr>
+        <w:t xml:space="preserve"> Mục tiêu đề tài</w:t>
+      </w:r>
+    </w:p>
+    <w:p>
+      <w:pPr>
+        <w:pStyle w:val="Heading3"/>
+      </w:pPr>
+      <w:r>
+        <w:rPr>
+          <w:rFonts w:eastAsia="Arial"/>
+        </w:rPr>
+        <w:t xml:space="preserve"> Mục tiêu tổng quát</w:t>
+      </w:r>
+    </w:p>
+    <w:p>
+      <w:pPr>
+        <w:spacing w:after="80" w:line="324" w:lineRule="auto"/>
+        <w:ind w:firstLine="510"/>
+        <w:jc w:val="both"/>
+      </w:pPr>
+      <w:r>
+        <w:t>Nghiên cứu nguyên lý hoạt động của disassembler và xây dựng một công cụ có khả năng đọc tệp nhị phân RISC-V, xác định vùng chứa mã lệnh, giải mã các instruction RV32I và xuất ra biểu diễn hợp ngữ tương ứng với độ trung thực cao đối với chương trình gốc.</w:t>
+      </w:r>
+    </w:p>
+    <w:p>
+      <w:pPr>
+        <w:pStyle w:val="Heading3"/>
+      </w:pPr>
+      <w:r>
+        <w:rPr>
+          <w:rFonts w:eastAsia="Arial"/>
         </w:rPr>
         <w:lastRenderedPageBreak/>
-        <w:t>CHƯƠNG 1. MỞ ĐẦU</w:t>
+        <w:t xml:space="preserve"> Mục tiêu cụ thể</w:t>
+      </w:r>
+    </w:p>
+    <w:p>
+      <w:pPr>
+        <w:spacing w:after="60" w:line="324" w:lineRule="auto"/>
+        <w:ind w:left="454" w:hanging="227"/>
+        <w:jc w:val="both"/>
+      </w:pPr>
+      <w:r>
+        <w:t>• Tìm hiểu cơ sở lý thuyết của disassembler và vai trò của disassembly trong phân tích chương trình ở mức thấp.</w:t>
+      </w:r>
+    </w:p>
+    <w:p>
+      <w:pPr>
+        <w:spacing w:after="60" w:line="324" w:lineRule="auto"/>
+        <w:ind w:left="454" w:hanging="227"/>
+        <w:jc w:val="both"/>
+      </w:pPr>
+      <w:r>
+        <w:t>• Nghiên cứu kiến trúc tập lệnh RISC-V, đặc biệt là RV32I, bao gồm định dạng lệnh, thanh ghi, opcode, funct3, funct7 và cơ chế mã hóa immediate.</w:t>
+      </w:r>
+    </w:p>
+    <w:p>
+      <w:pPr>
+        <w:spacing w:after="60" w:line="324" w:lineRule="auto"/>
+        <w:ind w:left="454" w:hanging="227"/>
+        <w:jc w:val="both"/>
+      </w:pPr>
+      <w:r>
+        <w:t>• Nghiên cứu cấu trúc file ELF và object file liên quan tới quá trình đọc section, symbol và relocation cần thiết cho disassembly.</w:t>
+      </w:r>
+    </w:p>
+    <w:p>
+      <w:pPr>
+        <w:spacing w:after="60" w:line="324" w:lineRule="auto"/>
+        <w:ind w:left="454" w:hanging="227"/>
+        <w:jc w:val="both"/>
+      </w:pPr>
+      <w:r>
+        <w:t>• Xây dựng parser để đọc ELF đầu vào, xác định section mã và ánh xạ địa chỉ logic của instruction.</w:t>
+      </w:r>
+    </w:p>
+    <w:p>
+      <w:pPr>
+        <w:spacing w:after="60" w:line="324" w:lineRule="auto"/>
+        <w:ind w:left="454" w:hanging="227"/>
+        <w:jc w:val="both"/>
+      </w:pPr>
+      <w:r>
+        <w:t>• Xây dựng bộ giải mã RV32I để biến dãy byte thành instruction có cấu trúc và có thể phát sinh đầu ra ở nhiều định dạng.</w:t>
+      </w:r>
+    </w:p>
+    <w:p>
+      <w:pPr>
+        <w:spacing w:after="60" w:line="324" w:lineRule="auto"/>
+        <w:ind w:left="454" w:hanging="227"/>
+        <w:jc w:val="both"/>
+      </w:pPr>
+      <w:r>
+        <w:t>• Thiết kế structured output làm nền cho các bước mở rộng như dựng CFG, tích hợp decompiler hoặc kiểm thử đối chiếu với công cụ chuẩn.</w:t>
+      </w:r>
+    </w:p>
+    <w:p>
+      <w:pPr>
+        <w:spacing w:after="60" w:line="324" w:lineRule="auto"/>
+        <w:ind w:left="454" w:hanging="227"/>
+        <w:jc w:val="both"/>
+      </w:pPr>
+      <w:r>
+        <w:t>• Đối chiếu kết quả với công cụ tham khảo như GNU objdump để đánh giá độ đúng của hệ thống.</w:t>
+      </w:r>
+    </w:p>
+    <w:p>
+      <w:pPr>
+        <w:pStyle w:val="Heading3"/>
+      </w:pPr>
+      <w:r>
+        <w:rPr>
+          <w:rFonts w:eastAsia="Arial"/>
+        </w:rPr>
+        <w:t xml:space="preserve"> Phạm vi đề tài</w:t>
+      </w:r>
+    </w:p>
+    <w:p>
+      <w:pPr>
+        <w:spacing w:after="80" w:line="324" w:lineRule="auto"/>
+        <w:ind w:firstLine="510"/>
+        <w:jc w:val="both"/>
+      </w:pPr>
+      <w:r>
+        <w:t>Để đảm bảo tính khả thi trong khuôn khổ học phần, phạm vi triển khai hiện tại của đề tài được giới hạn như sau:</w:t>
+      </w:r>
+    </w:p>
+    <w:p>
+      <w:pPr>
+        <w:spacing w:after="60" w:line="324" w:lineRule="auto"/>
+        <w:ind w:left="454" w:hanging="227"/>
+        <w:jc w:val="both"/>
+      </w:pPr>
+      <w:r>
+        <w:t>• Đầu vào là các file nhị phân RISC-V phổ biến trong bài toán dịch ngược cơ bản, ưu tiên ELF executable và relocatable object file (.o).</w:t>
+      </w:r>
+    </w:p>
+    <w:p>
+      <w:pPr>
+        <w:spacing w:after="60" w:line="324" w:lineRule="auto"/>
+        <w:ind w:left="454" w:hanging="227"/>
+        <w:jc w:val="both"/>
+      </w:pPr>
+      <w:r>
+        <w:t>• Kiến trúc hỗ trợ chính là RISC-V RV32I; các extension như M, C, F, D hoặc V chưa phải trọng tâm của giai đoạn hiện tại.</w:t>
+      </w:r>
+    </w:p>
+    <w:p>
+      <w:pPr>
+        <w:spacing w:after="60" w:line="324" w:lineRule="auto"/>
+        <w:ind w:left="454" w:hanging="227"/>
+        <w:jc w:val="both"/>
+      </w:pPr>
+      <w:r>
+        <w:t>• Giao diện sử dụng là CLI để giảm độ phức tạp triển khai; giao diện đồ họa và các tiện ích nâng cao được xem là hướng mở rộng.</w:t>
+      </w:r>
+    </w:p>
+    <w:p>
+      <w:pPr>
+        <w:spacing w:after="60" w:line="324" w:lineRule="auto"/>
+        <w:ind w:left="454" w:hanging="227"/>
+        <w:jc w:val="both"/>
+      </w:pPr>
+      <w:r>
+        <w:t>• Phần lõi tập trung vào parser, resolver và decoder; các bài toán nâng cao như function recovery, decompiler IR hoặc symbolic execution chưa được triển khai đầy đủ trong báo cáo này.</w:t>
+      </w:r>
+    </w:p>
+    <w:p>
+      <w:pPr>
+        <w:spacing w:after="60" w:line="324" w:lineRule="auto"/>
+        <w:ind w:left="454" w:hanging="227"/>
+        <w:jc w:val="both"/>
+      </w:pPr>
+      <w:r>
+        <w:t>• Đầu ra chuẩn được định hướng ở dạng JSON/structured output, đồng thời có thể bổ sung lớp text emitter để đối chiếu với objdump khi cần.</w:t>
+      </w:r>
+    </w:p>
+    <w:p>
+      <w:pPr>
+        <w:spacing w:line="324" w:lineRule="auto"/>
+      </w:pPr>
+      <w:r>
+        <w:br w:type="page"/>
+      </w:r>
+    </w:p>
+    <w:p>
+      <w:pPr>
+        <w:pStyle w:val="uchng"/>
+      </w:pPr>
+      <w:r>
+        <w:lastRenderedPageBreak/>
+        <w:t>CƠ SỞ LÝ THUYẾT VÀ CÔNG NGHỆ SỬ DỤNG</w:t>
+      </w:r>
+    </w:p>
+    <w:p>
+      <w:pPr>
+        <w:pStyle w:val="Heading2"/>
+      </w:pPr>
+      <w:r>
+        <w:rPr>
+          <w:rFonts w:eastAsia="Arial"/>
+        </w:rPr>
+        <w:t xml:space="preserve"> Cơ sở lý thuyết</w:t>
+      </w:r>
+    </w:p>
+    <w:p>
+      <w:pPr>
+        <w:pStyle w:val="Heading3"/>
+      </w:pPr>
+      <w:r>
+        <w:rPr>
+          <w:rFonts w:eastAsia="Arial"/>
+        </w:rPr>
+        <w:t xml:space="preserve"> Tổng quan về kiến trúc RISC-V và biến thể RV32I</w:t>
+      </w:r>
+    </w:p>
+    <w:p>
+      <w:pPr>
+        <w:spacing w:after="80" w:line="324" w:lineRule="auto"/>
+        <w:ind w:firstLine="510"/>
+        <w:jc w:val="both"/>
+      </w:pPr>
+      <w:r>
+        <w:t>RISC-V là kiến trúc tập lệnh mở theo triết lý RISC, được thiết kế để đơn giản, mô-đun và thuận lợi cho cả nghiên cứu lẫn triển khai công nghiệp. Trong hệ sinh thái RISC-V, RV32I là tập lệnh số nguyên cơ sở 32-bit, đủ tối thiểu để làm đích biên dịch cho trình biên dịch và môi trường hệ điều hành hiện đại [1].</w:t>
+      </w:r>
+    </w:p>
+    <w:p>
+      <w:pPr>
+        <w:spacing w:after="80" w:line="324" w:lineRule="auto"/>
+        <w:ind w:firstLine="510"/>
+        <w:jc w:val="both"/>
+      </w:pPr>
+      <w:r>
+        <w:t>Ở mức lập trình, RV32I sử dụng 32 thanh ghi tổng quát x0 đến x31 cùng thanh ghi đếm chương trình pc. Các instruction có độ dài cố định 32 bit và được mã hóa theo các định dạng chính như R, I, S, B, U và J. Việc các trường rd, rs1 và rs2 được đặt ở vị trí tương đối ổn định giữa các định dạng giúp đơn giản hóa phần cứng giải mã, đồng thời hỗ trợ xây dựng decoder phần mềm rõ ràng hơn [1].</w:t>
+      </w:r>
+    </w:p>
+    <w:p>
+      <w:pPr>
+        <w:spacing w:after="80" w:line="324" w:lineRule="auto"/>
+        <w:ind w:firstLine="510"/>
+        <w:jc w:val="both"/>
+      </w:pPr>
+      <w:r>
+        <w:t>Đối với disassembler, các đặc tính này có hai ý nghĩa quan trọng. Thứ nhất, việc mã hóa cố định 32 bit cho phép quét tuyến tính dễ dàng trong phạm vi RV32I cơ sở. Thứ hai, các quy tắc sign-extension và bố trí bit của immediate buộc decoder phải tách bit một cách chính xác thay vì chỉ in theo khuôn mẫu chuỗi ký tự.</w:t>
+      </w:r>
+    </w:p>
+    <w:p>
+      <w:pPr>
+        <w:pStyle w:val="Heading3"/>
+      </w:pPr>
+      <w:r>
+        <w:rPr>
+          <w:rFonts w:eastAsia="Arial"/>
+        </w:rPr>
+        <w:t xml:space="preserve"> Cấu trúc file ELF và ý nghĩa đối với disassembler</w:t>
+      </w:r>
+    </w:p>
+    <w:p>
+      <w:pPr>
+        <w:spacing w:after="80" w:line="324" w:lineRule="auto"/>
+        <w:ind w:firstLine="510"/>
+        <w:jc w:val="both"/>
+      </w:pPr>
+      <w:r>
+        <w:t>ELF (Executable and Linking Format) là định dạng đối tượng và thực thi phổ biến trong các hệ thống UNIX-like. Theo đặc tả gABI, phần ELF header đóng vai trò “bản đồ” mô tả cách tổ chức file; còn section giữ phần lớn thông tin ở góc nhìn liên kết như mã lệnh, dữ liệu, bảng ký hiệu và relocation [7].</w:t>
+      </w:r>
+    </w:p>
+    <w:p>
+      <w:pPr>
+        <w:spacing w:after="80" w:line="324" w:lineRule="auto"/>
+        <w:ind w:firstLine="510"/>
+        <w:jc w:val="both"/>
+      </w:pPr>
+      <w:r>
+        <w:t>Trong bài toán disassembly, parser cần đọc chính xác section header table để xác định vùng mã lệnh, nhất là .text, đồng thời tra cứu symbol table để phục hồi tên hàm hoặc nhãn khi dữ liệu còn tồn tại. Nếu làm việc với relocatable object file, thông tin relocation cũng quan trọng vì nó cho biết những vị trí nào trong mã cần được diễn giải theo ngữ cảnh liên kết chứ không chỉ là immediate thuần túy [8].</w:t>
+      </w:r>
+    </w:p>
+    <w:p>
+      <w:pPr>
+        <w:spacing w:after="80" w:line="324" w:lineRule="auto"/>
+        <w:ind w:firstLine="510"/>
+        <w:jc w:val="both"/>
+      </w:pPr>
+      <w:r>
+        <w:t>Do đó, việc hiểu ELF không chỉ phục vụ bước “đọc file”, mà còn quyết định mức độ giàu ngữ nghĩa của output. Một disassembler chỉ quét byte trong .text sẽ cho ra chuỗi assembly cơ bản; ngược lại, một disassembler biết khai thác symbol và relocation có thể tạo ra đầu ra gần với ngữ nghĩa chương trình hơn.</w:t>
+      </w:r>
+    </w:p>
+    <w:p>
+      <w:pPr>
+        <w:pStyle w:val="Heading3"/>
+      </w:pPr>
+      <w:r>
+        <w:rPr>
+          <w:rFonts w:eastAsia="Arial"/>
+        </w:rPr>
+        <w:lastRenderedPageBreak/>
+        <w:t xml:space="preserve"> Phân tích công cụ tham khảo và phương pháp tiếp cận: GNU objdump</w:t>
+      </w:r>
+    </w:p>
+    <w:p>
+      <w:pPr>
+        <w:spacing w:after="80" w:line="324" w:lineRule="auto"/>
+        <w:ind w:firstLine="510"/>
+        <w:jc w:val="both"/>
+      </w:pPr>
+      <w:r>
+        <w:t>GNU objdump là một trong những công cụ disassembly phổ biến nhất và là case study phù hợp để rút ra phương pháp thiết kế. Về bản chất, objdump thể hiện rõ tư tưởng phân lớp: lớp frontend nhận tham số dòng lệnh và điều phối, BFD trừu tượng hóa định dạng tệp, còn libopcodes đảm nhiệm logic giải mã theo từng kiến trúc [2], [3].</w:t>
+      </w:r>
+    </w:p>
+    <w:p>
+      <w:pPr>
+        <w:spacing w:after="80" w:line="324" w:lineRule="auto"/>
+        <w:ind w:firstLine="510"/>
+        <w:jc w:val="both"/>
+      </w:pPr>
+      <w:r>
+        <w:t>BFD sử dụng các cấu trúc canonical nội bộ để biểu diễn object file, nhờ đó lớp giải mã không phải làm việc trực tiếp với từng định dạng nhị phân cụ thể. Đây là ý tưởng có giá trị lớn đối với đề tài: nếu parser ELF và decoder bị dính chặt vào nhau, hệ thống sẽ khó mở rộng và khó kiểm thử. Ngược lại, một lớp chuẩn hóa nội bộ sẽ giúp cô lập phần phụ thuộc định dạng khỏi lõi giải mã [3].</w:t>
+      </w:r>
+    </w:p>
+    <w:p>
+      <w:pPr>
+        <w:spacing w:after="80" w:line="324" w:lineRule="auto"/>
+        <w:ind w:firstLine="510"/>
+        <w:jc w:val="both"/>
+      </w:pPr>
+      <w:r>
+        <w:t>Tuy nhiên, objdump cũng bộc lộ hai hạn chế khi nhìn từ mục tiêu của đồ án này. Thứ nhất, đầu ra chính của nó là chuỗi văn bản nhằm phục vụ quan sát của con người. Thứ hai, hệ sinh thái libbfd/libopcodes rất mạnh nhưng khá đồ sộ nếu chỉ cần một công cụ chuyên biệt cho RV32I. Vì vậy, báo cáo này chọn cách học theo tư tưởng kiến trúc của objdump nhưng giản lược phạm vi hiện thực [2]–[4].</w:t>
       </w:r>
     </w:p>
     <w:p>
@@ -1011,80 +1413,7 @@
           <w:b/>
           <w:sz w:val="27"/>
         </w:rPr>
-        <w:t>1.1. Lý do chọn đề tài</w:t>
-      </w:r>
-    </w:p>
-    <w:p>
-      <w:pPr>
-        <w:spacing w:after="80" w:line="324" w:lineRule="auto"/>
-        <w:ind w:firstLine="510"/>
-        <w:jc w:val="both"/>
-      </w:pPr>
-      <w:r>
-        <w:t>Máy tính hiện đại được tổ chức thành nhiều tầng trừu tượng: phần cứng, hệ điều hành, trình biên dịch, thư viện, chương trình và giao diện người dùng. Tuy nhiên, giữa ngôn ngữ nguồn và tầng thực thi luôn tồn tại một khoảng cách nhận thức đáng kể. Nhiều lỗi hệ thống, lỗ hổng bảo mật hoặc hành vi bất thường chỉ bộc lộ rõ khi quan sát chương trình ở mức mã máy.</w:t>
-      </w:r>
-    </w:p>
-    <w:p>
-      <w:pPr>
-        <w:spacing w:after="80" w:line="324" w:lineRule="auto"/>
-        <w:ind w:firstLine="510"/>
-        <w:jc w:val="both"/>
-      </w:pPr>
-      <w:r>
-        <w:t>Từ góc độ an ninh và phân tích nhị phân, disassembler là công cụ nền tảng trong ba bối cảnh tiêu biểu: phân tích mã độc, nghiên cứu lỗ hổng bảo mật và pháp y kỹ thuật số. Trong các tình huống này, đối tượng phân tích thường chỉ tồn tại dưới dạng file thực thi hoặc object file; vì vậy cần một công cụ có khả năng đọc, giải mã và tái hiện dòng lệnh hợp ngữ để phục vụ việc lập luận kỹ thuật.</w:t>
-      </w:r>
-    </w:p>
-    <w:p>
-      <w:pPr>
-        <w:spacing w:after="60" w:line="324" w:lineRule="auto"/>
-        <w:ind w:left="454" w:hanging="227"/>
-        <w:jc w:val="both"/>
-      </w:pPr>
-      <w:r>
-        <w:t>• Phân tích mã độc: hỗ trợ bóc tách các mẫu chương trình độc hại không có mã nguồn, từ đó xác định hành vi, luồng điều khiển và dấu hiệu né tránh phân tích.</w:t>
-      </w:r>
-    </w:p>
-    <w:p>
-      <w:pPr>
-        <w:spacing w:after="60" w:line="324" w:lineRule="auto"/>
-        <w:ind w:left="454" w:hanging="227"/>
-        <w:jc w:val="both"/>
-      </w:pPr>
-      <w:r>
-        <w:t>• Nghiên cứu lỗ hổng bảo mật: cho phép kiểm tra các đoạn mã nhị phân của thư viện, firmware hoặc ứng dụng đóng để phát hiện logic xử lý nguy hiểm.</w:t>
-      </w:r>
-    </w:p>
-    <w:p>
-      <w:pPr>
-        <w:spacing w:after="60" w:line="324" w:lineRule="auto"/>
-        <w:ind w:left="454" w:hanging="227"/>
-        <w:jc w:val="both"/>
-      </w:pPr>
-      <w:r>
-        <w:t>• Pháp y kỹ thuật số: hỗ trợ trích xuất bằng chứng từ phần mềm thu giữ được trong quá trình điều tra, nhất là khi tác giả phần mềm không cung cấp thông tin triển khai.</w:t>
-      </w:r>
-    </w:p>
-    <w:p>
-      <w:pPr>
-        <w:spacing w:after="80" w:line="324" w:lineRule="auto"/>
-        <w:ind w:firstLine="510"/>
-        <w:jc w:val="both"/>
-      </w:pPr>
-      <w:r>
-        <w:t>Mặc dù GNU objdump và nhiều công cụ mature khác đã hỗ trợ disassembly cho RISC-V, chúng thường được thiết kế theo hướng đa kiến trúc, đa định dạng và ưu tiên đầu ra văn bản cho người đọc. Đồ án này lựa chọn cách tiếp cận tối giản hơn: xây dựng một lõi chuyên biệt cho RV32I, tập trung vào tính đúng đắn của parser, resolver, decoder và mô hình dữ liệu đầu ra để phục vụ học tập cũng như nghiên cứu sâu hơn.</w:t>
-      </w:r>
-    </w:p>
-    <w:p>
-      <w:pPr>
-        <w:spacing w:before="160" w:after="80" w:line="324" w:lineRule="auto"/>
-      </w:pPr>
-      <w:r>
-        <w:rPr>
-          <w:rFonts w:ascii="Arial" w:eastAsia="Arial" w:hAnsi="Arial"/>
-          <w:b/>
-          <w:sz w:val="27"/>
-        </w:rPr>
-        <w:t>1.2. Mục tiêu đề tài</w:t>
+        <w:t>2.2. Định hướng kiến trúc phần mềm đề xuất</w:t>
       </w:r>
     </w:p>
     <w:p>
@@ -1097,7 +1426,7 @@
           <w:b/>
           <w:sz w:val="25"/>
         </w:rPr>
-        <w:t>1.2.1. Mục tiêu tổng quát</w:t>
+        <w:t>2.2.1. Nguyên tắc phân lớp và luồng xử lý</w:t>
       </w:r>
     </w:p>
     <w:p>
@@ -1107,7 +1436,27 @@
         <w:jc w:val="both"/>
       </w:pPr>
       <w:r>
-        <w:t>Nghiên cứu nguyên lý hoạt động của disassembler và xây dựng một công cụ có khả năng đọc tệp nhị phân RISC-V, xác định vùng chứa mã lệnh, giải mã các instruction RV32I và xuất ra biểu diễn hợp ngữ tương ứng với độ trung thực cao đối với chương trình gốc.</w:t>
+        <w:t>Qua quá trình trao đổi và rà soát yêu cầu, kiến trúc phần mềm của hệ thống được thống nhất theo hướng phân lớp rõ ràng. Từ góc nhìn triển khai, hệ thống có thể được hiểu theo năm lớp trách nhiệm chính: lớp giao diện CLI; lớp điều phối luồng xử lý; lớp truy cập dữ liệu nhị phân; lớp lõi giải mã; và lớp mô hình dữ liệu cùng hợp đồng output.</w:t>
+      </w:r>
+    </w:p>
+    <w:p>
+      <w:pPr>
+        <w:spacing w:after="80" w:line="324" w:lineRule="auto"/>
+        <w:ind w:firstLine="510"/>
+        <w:jc w:val="both"/>
+      </w:pPr>
+      <w:r>
+        <w:t>Cụ thể hơn, presentation layer chịu trách nhiệm nhận input, option và phản hồi cho người dùng. Application/orchestration layer điều phối pipeline mở file, parse, resolve, decode và emit. Infrastructure layer xử lý ELF loader/parser, byte access, endianness và các bảng header. Core/domain layer chứa resolver, decoder RV32I và các logic quy tắc nghiệp vụ. Cuối cùng, model/output layer biểu diễn BinaryImage, SectionRecord, SymbolRecord, InstructionIR và các đối tượng dùng để serialization.</w:t>
+      </w:r>
+    </w:p>
+    <w:p>
+      <w:pPr>
+        <w:spacing w:after="80" w:line="324" w:lineRule="auto"/>
+        <w:ind w:firstLine="510"/>
+        <w:jc w:val="both"/>
+      </w:pPr>
+      <w:r>
+        <w:t>Luồng xử lý tương ứng là: nhận file đầu vào → chuẩn hóa thông tin nhị phân → xác định section mã → giải mã instruction → sinh structured output → tùy chọn render thành văn bản assembly. Cách chia này bảo đảm mỗi khối có một nhiệm vụ rõ ràng và giảm phụ thuộc chéo giữa parser và decoder.</w:t>
       </w:r>
     </w:p>
     <w:p>
@@ -1120,91 +1469,7 @@
           <w:b/>
           <w:sz w:val="25"/>
         </w:rPr>
-        <w:t>1.2.2. Mục tiêu cụ thể</w:t>
-      </w:r>
-    </w:p>
-    <w:p>
-      <w:pPr>
-        <w:spacing w:after="60" w:line="324" w:lineRule="auto"/>
-        <w:ind w:left="454" w:hanging="227"/>
-        <w:jc w:val="both"/>
-      </w:pPr>
-      <w:r>
-        <w:t>• Tìm hiểu cơ sở lý thuyết của disassembler và vai trò của disassembly trong phân tích chương trình ở mức thấp.</w:t>
-      </w:r>
-    </w:p>
-    <w:p>
-      <w:pPr>
-        <w:spacing w:after="60" w:line="324" w:lineRule="auto"/>
-        <w:ind w:left="454" w:hanging="227"/>
-        <w:jc w:val="both"/>
-      </w:pPr>
-      <w:r>
-        <w:lastRenderedPageBreak/>
-        <w:t>• Nghiên cứu kiến trúc tập lệnh RISC-V, đặc biệt là RV32I, bao gồm định dạng lệnh, thanh ghi, opcode, funct3, funct7 và cơ chế mã hóa immediate.</w:t>
-      </w:r>
-    </w:p>
-    <w:p>
-      <w:pPr>
-        <w:spacing w:after="60" w:line="324" w:lineRule="auto"/>
-        <w:ind w:left="454" w:hanging="227"/>
-        <w:jc w:val="both"/>
-      </w:pPr>
-      <w:r>
-        <w:t>• Nghiên cứu cấu trúc file ELF và object file liên quan tới quá trình đọc section, symbol và relocation cần thiết cho disassembly.</w:t>
-      </w:r>
-    </w:p>
-    <w:p>
-      <w:pPr>
-        <w:spacing w:after="60" w:line="324" w:lineRule="auto"/>
-        <w:ind w:left="454" w:hanging="227"/>
-        <w:jc w:val="both"/>
-      </w:pPr>
-      <w:r>
-        <w:t>• Xây dựng parser để đọc ELF đầu vào, xác định section mã và ánh xạ địa chỉ logic của instruction.</w:t>
-      </w:r>
-    </w:p>
-    <w:p>
-      <w:pPr>
-        <w:spacing w:after="60" w:line="324" w:lineRule="auto"/>
-        <w:ind w:left="454" w:hanging="227"/>
-        <w:jc w:val="both"/>
-      </w:pPr>
-      <w:r>
-        <w:t>• Xây dựng bộ giải mã RV32I để biến dãy byte thành instruction có cấu trúc và có thể phát sinh đầu ra ở nhiều định dạng.</w:t>
-      </w:r>
-    </w:p>
-    <w:p>
-      <w:pPr>
-        <w:spacing w:after="60" w:line="324" w:lineRule="auto"/>
-        <w:ind w:left="454" w:hanging="227"/>
-        <w:jc w:val="both"/>
-      </w:pPr>
-      <w:r>
-        <w:t>• Thiết kế structured output làm nền cho các bước mở rộng như dựng CFG, tích hợp decompiler hoặc kiểm thử đối chiếu với công cụ chuẩn.</w:t>
-      </w:r>
-    </w:p>
-    <w:p>
-      <w:pPr>
-        <w:spacing w:after="60" w:line="324" w:lineRule="auto"/>
-        <w:ind w:left="454" w:hanging="227"/>
-        <w:jc w:val="both"/>
-      </w:pPr>
-      <w:r>
-        <w:t>• Đối chiếu kết quả với công cụ tham khảo như GNU objdump để đánh giá độ đúng của hệ thống.</w:t>
-      </w:r>
-    </w:p>
-    <w:p>
-      <w:pPr>
-        <w:spacing w:before="160" w:after="80" w:line="324" w:lineRule="auto"/>
-      </w:pPr>
-      <w:r>
-        <w:rPr>
-          <w:rFonts w:ascii="Arial" w:eastAsia="Arial" w:hAnsi="Arial"/>
-          <w:b/>
-          <w:sz w:val="27"/>
-        </w:rPr>
-        <w:t>1.3. Phạm vi đề tài</w:t>
+        <w:t>2.2.2. Chuẩn hóa dữ liệu đầu vào và mô hình canonical nội bộ</w:t>
       </w:r>
     </w:p>
     <w:p>
@@ -1214,309 +1479,8 @@
         <w:jc w:val="both"/>
       </w:pPr>
       <w:r>
-        <w:t>Để đảm bảo tính khả thi trong khuôn khổ học phần, phạm vi triển khai hiện tại của đề tài được giới hạn như sau:</w:t>
-      </w:r>
-    </w:p>
-    <w:p>
-      <w:pPr>
-        <w:spacing w:after="60" w:line="324" w:lineRule="auto"/>
-        <w:ind w:left="454" w:hanging="227"/>
-        <w:jc w:val="both"/>
-      </w:pPr>
-      <w:r>
-        <w:t>• Đầu vào là các file nhị phân RISC-V phổ biến trong bài toán dịch ngược cơ bản, ưu tiên ELF executable và relocatable object file (.o).</w:t>
-      </w:r>
-    </w:p>
-    <w:p>
-      <w:pPr>
-        <w:spacing w:after="60" w:line="324" w:lineRule="auto"/>
-        <w:ind w:left="454" w:hanging="227"/>
-        <w:jc w:val="both"/>
-      </w:pPr>
-      <w:r>
-        <w:t>• Kiến trúc hỗ trợ chính là RISC-V RV32I; các extension như M, C, F, D hoặc V chưa phải trọng tâm của giai đoạn hiện tại.</w:t>
-      </w:r>
-    </w:p>
-    <w:p>
-      <w:pPr>
-        <w:spacing w:after="60" w:line="324" w:lineRule="auto"/>
-        <w:ind w:left="454" w:hanging="227"/>
-        <w:jc w:val="both"/>
-      </w:pPr>
-      <w:r>
-        <w:t>• Giao diện sử dụng là CLI để giảm độ phức tạp triển khai; giao diện đồ họa và các tiện ích nâng cao được xem là hướng mở rộng.</w:t>
-      </w:r>
-    </w:p>
-    <w:p>
-      <w:pPr>
-        <w:spacing w:after="60" w:line="324" w:lineRule="auto"/>
-        <w:ind w:left="454" w:hanging="227"/>
-        <w:jc w:val="both"/>
-      </w:pPr>
-      <w:r>
-        <w:t>• Phần lõi tập trung vào parser, resolver và decoder; các bài toán nâng cao như function recovery, decompiler IR hoặc symbolic execution chưa được triển khai đầy đủ trong báo cáo này.</w:t>
-      </w:r>
-    </w:p>
-    <w:p>
-      <w:pPr>
-        <w:spacing w:after="60" w:line="324" w:lineRule="auto"/>
-        <w:ind w:left="454" w:hanging="227"/>
-        <w:jc w:val="both"/>
-      </w:pPr>
-      <w:r>
-        <w:t>• Đầu ra chuẩn được định hướng ở dạng JSON/structured output, đồng thời có thể bổ sung lớp text emitter để đối chiếu với objdump khi cần.</w:t>
-      </w:r>
-    </w:p>
-    <w:p>
-      <w:pPr>
-        <w:spacing w:line="324" w:lineRule="auto"/>
-      </w:pPr>
-      <w:r>
-        <w:br w:type="page"/>
-      </w:r>
-    </w:p>
-    <w:p>
-      <w:pPr>
-        <w:tabs>
-          <w:tab w:val="right" w:leader="dot" w:pos="8787"/>
-        </w:tabs>
-        <w:spacing w:after="60" w:line="324" w:lineRule="auto"/>
-      </w:pPr>
-      <w:r>
-        <w:rPr>
-          <w:b/>
-        </w:rPr>
         <w:lastRenderedPageBreak/>
-        <w:t>CHƯƠNG 2. CƠ SỞ LÝ THUYẾT VÀ CÔNG NGHỆ SỬ DỤNG</w:t>
-      </w:r>
-    </w:p>
-    <w:p>
-      <w:pPr>
-        <w:spacing w:before="160" w:after="80" w:line="324" w:lineRule="auto"/>
-      </w:pPr>
-      <w:r>
-        <w:rPr>
-          <w:rFonts w:ascii="Arial" w:eastAsia="Arial" w:hAnsi="Arial"/>
-          <w:b/>
-          <w:sz w:val="27"/>
-        </w:rPr>
-        <w:t>2.1. Cơ sở lý thuyết</w:t>
-      </w:r>
-    </w:p>
-    <w:p>
-      <w:pPr>
-        <w:spacing w:before="80" w:after="80" w:line="324" w:lineRule="auto"/>
-      </w:pPr>
-      <w:r>
-        <w:rPr>
-          <w:rFonts w:ascii="Arial" w:eastAsia="Arial" w:hAnsi="Arial"/>
-          <w:b/>
-          <w:sz w:val="25"/>
-        </w:rPr>
-        <w:t>2.1.1. Tổng quan về kiến trúc RISC-V và biến thể RV32I</w:t>
-      </w:r>
-    </w:p>
-    <w:p>
-      <w:pPr>
-        <w:spacing w:after="80" w:line="324" w:lineRule="auto"/>
-        <w:ind w:firstLine="510"/>
-        <w:jc w:val="both"/>
-      </w:pPr>
-      <w:r>
-        <w:t>RISC-V là kiến trúc tập lệnh mở theo triết lý RISC, được thiết kế để đơn giản, mô-đun và thuận lợi cho cả nghiên cứu lẫn triển khai công nghiệp. Trong hệ sinh thái RISC-V, RV32I là tập lệnh số nguyên cơ sở 32-bit, đủ tối thiểu để làm đích biên dịch cho trình biên dịch và môi trường hệ điều hành hiện đại [1].</w:t>
-      </w:r>
-    </w:p>
-    <w:p>
-      <w:pPr>
-        <w:spacing w:after="80" w:line="324" w:lineRule="auto"/>
-        <w:ind w:firstLine="510"/>
-        <w:jc w:val="both"/>
-      </w:pPr>
-      <w:r>
-        <w:t>Ở mức lập trình, RV32I sử dụng 32 thanh ghi tổng quát x0 đến x31 cùng thanh ghi đếm chương trình pc. Các instruction có độ dài cố định 32 bit và được mã hóa theo các định dạng chính như R, I, S, B, U và J. Việc các trường rd, rs1 và rs2 được đặt ở vị trí tương đối ổn định giữa các định dạng giúp đơn giản hóa phần cứng giải mã, đồng thời hỗ trợ xây dựng decoder phần mềm rõ ràng hơn [1].</w:t>
-      </w:r>
-    </w:p>
-    <w:p>
-      <w:pPr>
-        <w:spacing w:after="80" w:line="324" w:lineRule="auto"/>
-        <w:ind w:firstLine="510"/>
-        <w:jc w:val="both"/>
-      </w:pPr>
-      <w:r>
-        <w:t>Đối với disassembler, các đặc tính này có hai ý nghĩa quan trọng. Thứ nhất, việc mã hóa cố định 32 bit cho phép quét tuyến tính dễ dàng trong phạm vi RV32I cơ sở. Thứ hai, các quy tắc sign-extension và bố trí bit của immediate buộc decoder phải tách bit một cách chính xác thay vì chỉ in theo khuôn mẫu chuỗi ký tự.</w:t>
-      </w:r>
-    </w:p>
-    <w:p>
-      <w:pPr>
-        <w:spacing w:before="80" w:after="80" w:line="324" w:lineRule="auto"/>
-      </w:pPr>
-      <w:r>
-        <w:rPr>
-          <w:rFonts w:ascii="Arial" w:eastAsia="Arial" w:hAnsi="Arial"/>
-          <w:b/>
-          <w:sz w:val="25"/>
-        </w:rPr>
-        <w:t>2.1.2. Cấu trúc file ELF và ý nghĩa đối với disassembler</w:t>
-      </w:r>
-    </w:p>
-    <w:p>
-      <w:pPr>
-        <w:spacing w:after="80" w:line="324" w:lineRule="auto"/>
-        <w:ind w:firstLine="510"/>
-        <w:jc w:val="both"/>
-      </w:pPr>
-      <w:r>
-        <w:t>ELF (Executable and Linking Format) là định dạng đối tượng và thực thi phổ biến trong các hệ thống UNIX-like. Theo đặc tả gABI, phần ELF header đóng vai trò “bản đồ” mô tả cách tổ chức file; còn section giữ phần lớn thông tin ở góc nhìn liên kết như mã lệnh, dữ liệu, bảng ký hiệu và relocation [7].</w:t>
-      </w:r>
-    </w:p>
-    <w:p>
-      <w:pPr>
-        <w:spacing w:after="80" w:line="324" w:lineRule="auto"/>
-        <w:ind w:firstLine="510"/>
-        <w:jc w:val="both"/>
-      </w:pPr>
-      <w:r>
-        <w:t>Trong bài toán disassembly, parser cần đọc chính xác section header table để xác định vùng mã lệnh, nhất là .text, đồng thời tra cứu symbol table để phục hồi tên hàm hoặc nhãn khi dữ liệu còn tồn tại. Nếu làm việc với relocatable object file, thông tin relocation cũng quan trọng vì nó cho biết những vị trí nào trong mã cần được diễn giải theo ngữ cảnh liên kết chứ không chỉ là immediate thuần túy [8].</w:t>
-      </w:r>
-    </w:p>
-    <w:p>
-      <w:pPr>
-        <w:spacing w:after="80" w:line="324" w:lineRule="auto"/>
-        <w:ind w:firstLine="510"/>
-        <w:jc w:val="both"/>
-      </w:pPr>
-      <w:r>
-        <w:t>Do đó, việc hiểu ELF không chỉ phục vụ bước “đọc file”, mà còn quyết định mức độ giàu ngữ nghĩa của output. Một disassembler chỉ quét byte trong .text sẽ cho ra chuỗi assembly cơ bản; ngược lại, một disassembler biết khai thác symbol và relocation có thể tạo ra đầu ra gần với ngữ nghĩa chương trình hơn.</w:t>
-      </w:r>
-    </w:p>
-    <w:p>
-      <w:pPr>
-        <w:spacing w:before="80" w:after="80" w:line="324" w:lineRule="auto"/>
-      </w:pPr>
-      <w:r>
-        <w:rPr>
-          <w:rFonts w:ascii="Arial" w:eastAsia="Arial" w:hAnsi="Arial"/>
-          <w:b/>
-          <w:sz w:val="25"/>
-        </w:rPr>
-        <w:t>2.1.3. Phân tích công cụ tham khảo và phương pháp tiếp cận: GNU objdump</w:t>
-      </w:r>
-    </w:p>
-    <w:p>
-      <w:pPr>
-        <w:spacing w:after="80" w:line="324" w:lineRule="auto"/>
-        <w:ind w:firstLine="510"/>
-        <w:jc w:val="both"/>
-      </w:pPr>
-      <w:r>
-        <w:t xml:space="preserve">GNU objdump là một trong những công cụ disassembly phổ biến nhất và là case study phù hợp để rút ra phương pháp thiết kế. Về bản chất, objdump thể hiện rõ tư tưởng </w:t>
-      </w:r>
-      <w:r>
-        <w:lastRenderedPageBreak/>
-        <w:t>phân lớp: lớp frontend nhận tham số dòng lệnh và điều phối, BFD trừu tượng hóa định dạng tệp, còn libopcodes đảm nhiệm logic giải mã theo từng kiến trúc [2], [3].</w:t>
-      </w:r>
-    </w:p>
-    <w:p>
-      <w:pPr>
-        <w:spacing w:after="80" w:line="324" w:lineRule="auto"/>
-        <w:ind w:firstLine="510"/>
-        <w:jc w:val="both"/>
-      </w:pPr>
-      <w:r>
-        <w:t>BFD sử dụng các cấu trúc canonical nội bộ để biểu diễn object file, nhờ đó lớp giải mã không phải làm việc trực tiếp với từng định dạng nhị phân cụ thể. Đây là ý tưởng có giá trị lớn đối với đề tài: nếu parser ELF và decoder bị dính chặt vào nhau, hệ thống sẽ khó mở rộng và khó kiểm thử. Ngược lại, một lớp chuẩn hóa nội bộ sẽ giúp cô lập phần phụ thuộc định dạng khỏi lõi giải mã [3].</w:t>
-      </w:r>
-    </w:p>
-    <w:p>
-      <w:pPr>
-        <w:spacing w:after="80" w:line="324" w:lineRule="auto"/>
-        <w:ind w:firstLine="510"/>
-        <w:jc w:val="both"/>
-      </w:pPr>
-      <w:r>
-        <w:t>Tuy nhiên, objdump cũng bộc lộ hai hạn chế khi nhìn từ mục tiêu của đồ án này. Thứ nhất, đầu ra chính của nó là chuỗi văn bản nhằm phục vụ quan sát của con người. Thứ hai, hệ sinh thái libbfd/libopcodes rất mạnh nhưng khá đồ sộ nếu chỉ cần một công cụ chuyên biệt cho RV32I. Vì vậy, báo cáo này chọn cách học theo tư tưởng kiến trúc của objdump nhưng giản lược phạm vi hiện thực [2]–[4].</w:t>
-      </w:r>
-    </w:p>
-    <w:p>
-      <w:pPr>
-        <w:spacing w:before="160" w:after="80" w:line="324" w:lineRule="auto"/>
-      </w:pPr>
-      <w:r>
-        <w:rPr>
-          <w:rFonts w:ascii="Arial" w:eastAsia="Arial" w:hAnsi="Arial"/>
-          <w:b/>
-          <w:sz w:val="27"/>
-        </w:rPr>
-        <w:t>2.2. Định hướng kiến trúc phần mềm đề xuất</w:t>
-      </w:r>
-    </w:p>
-    <w:p>
-      <w:pPr>
-        <w:spacing w:before="80" w:after="80" w:line="324" w:lineRule="auto"/>
-      </w:pPr>
-      <w:r>
-        <w:rPr>
-          <w:rFonts w:ascii="Arial" w:eastAsia="Arial" w:hAnsi="Arial"/>
-          <w:b/>
-          <w:sz w:val="25"/>
-        </w:rPr>
-        <w:t>2.2.1. Nguyên tắc phân lớp và luồng xử lý</w:t>
-      </w:r>
-    </w:p>
-    <w:p>
-      <w:pPr>
-        <w:spacing w:after="80" w:line="324" w:lineRule="auto"/>
-        <w:ind w:firstLine="510"/>
-        <w:jc w:val="both"/>
-      </w:pPr>
-      <w:r>
-        <w:t>Qua quá trình trao đổi và rà soát yêu cầu, kiến trúc phần mềm của hệ thống được thống nhất theo hướng phân lớp rõ ràng. Từ góc nhìn triển khai, hệ thống có thể được hiểu theo năm lớp trách nhiệm chính: lớp giao diện CLI; lớp điều phối luồng xử lý; lớp truy cập dữ liệu nhị phân; lớp lõi giải mã; và lớp mô hình dữ liệu cùng hợp đồng output.</w:t>
-      </w:r>
-    </w:p>
-    <w:p>
-      <w:pPr>
-        <w:spacing w:after="80" w:line="324" w:lineRule="auto"/>
-        <w:ind w:firstLine="510"/>
-        <w:jc w:val="both"/>
-      </w:pPr>
-      <w:r>
-        <w:t>Cụ thể hơn, presentation layer chịu trách nhiệm nhận input, option và phản hồi cho người dùng. Application/orchestration layer điều phối pipeline mở file, parse, resolve, decode và emit. Infrastructure layer xử lý ELF loader/parser, byte access, endianness và các bảng header. Core/domain layer chứa resolver, decoder RV32I và các logic quy tắc nghiệp vụ. Cuối cùng, model/output layer biểu diễn BinaryImage, SectionRecord, SymbolRecord, InstructionIR và các đối tượng dùng để serialization.</w:t>
-      </w:r>
-    </w:p>
-    <w:p>
-      <w:pPr>
-        <w:spacing w:after="80" w:line="324" w:lineRule="auto"/>
-        <w:ind w:firstLine="510"/>
-        <w:jc w:val="both"/>
-      </w:pPr>
-      <w:r>
-        <w:t>Luồng xử lý tương ứng là: nhận file đầu vào → chuẩn hóa thông tin nhị phân → xác định section mã → giải mã instruction → sinh structured output → tùy chọn render thành văn bản assembly. Cách chia này bảo đảm mỗi khối có một nhiệm vụ rõ ràng và giảm phụ thuộc chéo giữa parser và decoder.</w:t>
-      </w:r>
-    </w:p>
-    <w:p>
-      <w:pPr>
-        <w:spacing w:before="80" w:after="80" w:line="324" w:lineRule="auto"/>
-      </w:pPr>
-      <w:r>
-        <w:rPr>
-          <w:rFonts w:ascii="Arial" w:eastAsia="Arial" w:hAnsi="Arial"/>
-          <w:b/>
-          <w:sz w:val="25"/>
-        </w:rPr>
-        <w:t>2.2.2. Chuẩn hóa dữ liệu đầu vào và mô hình canonical nội bộ</w:t>
-      </w:r>
-    </w:p>
-    <w:p>
-      <w:pPr>
-        <w:spacing w:after="80" w:line="324" w:lineRule="auto"/>
-        <w:ind w:firstLine="510"/>
-        <w:jc w:val="both"/>
-      </w:pPr>
-      <w:r>
-        <w:t xml:space="preserve">Một điểm đã được thống nhất là hệ thống nên học theo tư tưởng của BFD nhưng không sao chép toàn bộ BFD. Nói cách khác, đề tài nên xây dựng một mô hình canonical </w:t>
-      </w:r>
-      <w:r>
-        <w:lastRenderedPageBreak/>
-        <w:t>nội bộ kiểu “mini-BFD” thay vì cố hiện thực một framework tổng quát cho nhiều định dạng và nhiều kiến trúc.</w:t>
+        <w:t>Một điểm đã được thống nhất là hệ thống nên học theo tư tưởng của BFD nhưng không sao chép toàn bộ BFD. Nói cách khác, đề tài nên xây dựng một mô hình canonical nội bộ kiểu “mini-BFD” thay vì cố hiện thực một framework tổng quát cho nhiều định dạng và nhiều kiến trúc.</w:t>
       </w:r>
       <w:r>
         <w:footnoteReference w:id="1"/>
@@ -1619,6 +1583,7 @@
         <w:jc w:val="both"/>
       </w:pPr>
       <w:r>
+        <w:lastRenderedPageBreak/>
         <w:t>ELF (</w:t>
       </w:r>
       <w:proofErr w:type="spellStart"/>
@@ -1659,21 +1624,22 @@
       </w:r>
       <w:proofErr w:type="spellEnd"/>
       <w:r>
-        <w:t xml:space="preserve"> file và thư viện. Trong bài toán disassembler, việc hiểu đúng cấu trúc ELF là điều kiện tiên quyết để chương trình có thể xác định chính xác </w:t>
-      </w:r>
-      <w:r>
-        <w:lastRenderedPageBreak/>
-        <w:t xml:space="preserve">vùng mã lệnh cần dịch. Một file ELF thường gồm các thành phần quan trọng như </w:t>
+        <w:t xml:space="preserve"> </w:t>
+      </w:r>
+      <w:proofErr w:type="spellStart"/>
+      <w:r>
+        <w:t>file</w:t>
+      </w:r>
+      <w:proofErr w:type="spellEnd"/>
+      <w:r>
+        <w:t xml:space="preserve"> và thư viện. Trong bài toán disassembler, việc hiểu đúng cấu trúc ELF là điều kiện tiên quyết để chương trình có thể xác định chính xác vùng mã lệnh cần dịch. Một file ELF thường gồm các thành phần quan trọng như </w:t>
       </w:r>
       <w:r>
         <w:rPr>
           <w:b/>
           <w:bCs/>
         </w:rPr>
-        <w:t>ELF Header</w:t>
-      </w:r>
-      <w:r>
-        <w:t xml:space="preserve">, </w:t>
+        <w:t xml:space="preserve">ELF </w:t>
       </w:r>
       <w:proofErr w:type="spellStart"/>
       <w:r>
@@ -1681,59 +1647,122 @@
           <w:b/>
           <w:bCs/>
         </w:rPr>
-        <w:t>Program</w:t>
+        <w:t>Header</w:t>
       </w:r>
       <w:proofErr w:type="spellEnd"/>
+      <w:r>
+        <w:t xml:space="preserve">, </w:t>
+      </w:r>
+      <w:proofErr w:type="spellStart"/>
       <w:r>
         <w:rPr>
           <w:b/>
           <w:bCs/>
         </w:rPr>
-        <w:t xml:space="preserve"> Header </w:t>
-      </w:r>
-      <w:proofErr w:type="spellStart"/>
+        <w:t>Program</w:t>
+      </w:r>
+      <w:proofErr w:type="spellEnd"/>
       <w:r>
         <w:rPr>
           <w:b/>
           <w:bCs/>
         </w:rPr>
-        <w:t>Table</w:t>
-      </w:r>
-      <w:proofErr w:type="spellEnd"/>
-      <w:r>
-        <w:t xml:space="preserve">, </w:t>
-      </w:r>
+        <w:t xml:space="preserve"> </w:t>
+      </w:r>
+      <w:proofErr w:type="spellStart"/>
       <w:r>
         <w:rPr>
           <w:b/>
           <w:bCs/>
         </w:rPr>
-        <w:t xml:space="preserve">Section Header </w:t>
-      </w:r>
-      <w:proofErr w:type="spellStart"/>
+        <w:t>Header</w:t>
+      </w:r>
+      <w:proofErr w:type="spellEnd"/>
       <w:r>
         <w:rPr>
           <w:b/>
           <w:bCs/>
         </w:rPr>
-        <w:t>Table</w:t>
-      </w:r>
-      <w:proofErr w:type="spellEnd"/>
-      <w:r>
-        <w:t xml:space="preserve"> và các </w:t>
-      </w:r>
+        <w:t xml:space="preserve"> </w:t>
+      </w:r>
+      <w:proofErr w:type="spellStart"/>
       <w:r>
         <w:rPr>
           <w:b/>
           <w:bCs/>
         </w:rPr>
+        <w:t>Table</w:t>
+      </w:r>
+      <w:proofErr w:type="spellEnd"/>
+      <w:r>
+        <w:t xml:space="preserve">, </w:t>
+      </w:r>
+      <w:proofErr w:type="spellStart"/>
+      <w:r>
+        <w:rPr>
+          <w:b/>
+          <w:bCs/>
+        </w:rPr>
+        <w:t>Section</w:t>
+      </w:r>
+      <w:proofErr w:type="spellEnd"/>
+      <w:r>
+        <w:rPr>
+          <w:b/>
+          <w:bCs/>
+        </w:rPr>
+        <w:t xml:space="preserve"> </w:t>
+      </w:r>
+      <w:proofErr w:type="spellStart"/>
+      <w:r>
+        <w:rPr>
+          <w:b/>
+          <w:bCs/>
+        </w:rPr>
+        <w:t>Header</w:t>
+      </w:r>
+      <w:proofErr w:type="spellEnd"/>
+      <w:r>
+        <w:rPr>
+          <w:b/>
+          <w:bCs/>
+        </w:rPr>
+        <w:t xml:space="preserve"> </w:t>
+      </w:r>
+      <w:proofErr w:type="spellStart"/>
+      <w:r>
+        <w:rPr>
+          <w:b/>
+          <w:bCs/>
+        </w:rPr>
+        <w:t>Table</w:t>
+      </w:r>
+      <w:proofErr w:type="spellEnd"/>
+      <w:r>
+        <w:t xml:space="preserve"> và các </w:t>
+      </w:r>
+      <w:proofErr w:type="spellStart"/>
+      <w:r>
+        <w:rPr>
+          <w:b/>
+          <w:bCs/>
+        </w:rPr>
         <w:t>section</w:t>
       </w:r>
-      <w:r>
-        <w:t xml:space="preserve"> dữ liệu. Trong đó, ELF Header chứa các thông tin nhận dạng file như </w:t>
+      <w:proofErr w:type="spellEnd"/>
+      <w:r>
+        <w:t xml:space="preserve"> dữ liệu. Trong đó, ELF Header chứa các thông tin nhận dạng </w:t>
       </w:r>
       <w:proofErr w:type="spellStart"/>
       <w:r>
+        <w:t>file</w:t>
+      </w:r>
+      <w:proofErr w:type="spellEnd"/>
+      <w:r>
+        <w:t xml:space="preserve"> như </w:t>
+      </w:r>
+      <w:proofErr w:type="spellStart"/>
+      <w:r>
         <w:t>magic</w:t>
       </w:r>
       <w:proofErr w:type="spellEnd"/>
@@ -1762,18 +1791,42 @@
       </w:r>
       <w:proofErr w:type="spellEnd"/>
       <w:r>
-        <w:t xml:space="preserve"> và vị trí các bảng mô tả; Section Header </w:t>
+        <w:t xml:space="preserve"> và vị trí các bảng mô tả; </w:t>
       </w:r>
       <w:proofErr w:type="spellStart"/>
       <w:r>
+        <w:t>Section</w:t>
+      </w:r>
+      <w:proofErr w:type="spellEnd"/>
+      <w:r>
+        <w:t xml:space="preserve"> </w:t>
+      </w:r>
+      <w:proofErr w:type="spellStart"/>
+      <w:r>
+        <w:t>Header</w:t>
+      </w:r>
+      <w:proofErr w:type="spellEnd"/>
+      <w:r>
+        <w:t xml:space="preserve"> </w:t>
+      </w:r>
+      <w:proofErr w:type="spellStart"/>
+      <w:r>
         <w:t>Table</w:t>
       </w:r>
       <w:proofErr w:type="spellEnd"/>
       <w:r>
-        <w:t xml:space="preserve"> dùng để mô tả các section như .</w:t>
+        <w:t xml:space="preserve"> dùng để mô tả các </w:t>
       </w:r>
       <w:proofErr w:type="spellStart"/>
       <w:r>
+        <w:t>section</w:t>
+      </w:r>
+      <w:proofErr w:type="spellEnd"/>
+      <w:r>
+        <w:t xml:space="preserve"> như .</w:t>
+      </w:r>
+      <w:proofErr w:type="spellStart"/>
+      <w:r>
         <w:t>text</w:t>
       </w:r>
       <w:proofErr w:type="spellEnd"/>
@@ -1810,15 +1863,31 @@
       </w:r>
       <w:proofErr w:type="spellEnd"/>
       <w:r>
-        <w:t>; còn section .</w:t>
+        <w:t xml:space="preserve">; còn </w:t>
       </w:r>
       <w:proofErr w:type="spellStart"/>
       <w:r>
+        <w:t>section</w:t>
+      </w:r>
+      <w:proofErr w:type="spellEnd"/>
+      <w:r>
+        <w:t xml:space="preserve"> .</w:t>
+      </w:r>
+      <w:proofErr w:type="spellStart"/>
+      <w:r>
         <w:t>text</w:t>
       </w:r>
       <w:proofErr w:type="spellEnd"/>
       <w:r>
-        <w:t xml:space="preserve"> thường là nơi chứa mã máy cần disassemble. Vì vậy, muốn disassembler hoạt động đúng thì trước hết phải đọc đúng các trường trong ELF, xác định đúng tên section, </w:t>
+        <w:t xml:space="preserve"> thường là nơi chứa mã máy cần disassemble. Vì vậy, muốn disassembler hoạt động đúng thì trước hết phải đọc đúng các trường trong ELF, xác định đúng tên </w:t>
+      </w:r>
+      <w:proofErr w:type="spellStart"/>
+      <w:r>
+        <w:t>section</w:t>
+      </w:r>
+      <w:proofErr w:type="spellEnd"/>
+      <w:r>
+        <w:t xml:space="preserve">, </w:t>
       </w:r>
       <w:proofErr w:type="spellStart"/>
       <w:r>
@@ -1885,15 +1954,31 @@
       </w:r>
       <w:proofErr w:type="spellEnd"/>
       <w:r>
-        <w:t xml:space="preserve"> và objdump để kiểm tra tính chính xác của việc đọc section, giải mã lệnh, xác định địa chỉ và hiển thị toán hạng. Ngoài ra, cần xây dựng bộ </w:t>
+        <w:t xml:space="preserve"> và </w:t>
       </w:r>
       <w:proofErr w:type="spellStart"/>
       <w:r>
+        <w:t>objdump</w:t>
+      </w:r>
+      <w:proofErr w:type="spellEnd"/>
+      <w:r>
+        <w:t xml:space="preserve"> để kiểm tra tính chính xác của việc đọc section, giải mã lệnh, xác định địa chỉ và hiển thị toán hạng. Ngoài ra, cần xây dựng bộ </w:t>
+      </w:r>
+      <w:proofErr w:type="spellStart"/>
+      <w:r>
         <w:t>test</w:t>
       </w:r>
       <w:proofErr w:type="spellEnd"/>
       <w:r>
-        <w:t xml:space="preserve"> gồm các file ELF đơn giản, các chương trình </w:t>
+        <w:t xml:space="preserve"> gồm các </w:t>
+      </w:r>
+      <w:proofErr w:type="spellStart"/>
+      <w:r>
+        <w:t>file</w:t>
+      </w:r>
+      <w:proofErr w:type="spellEnd"/>
+      <w:r>
+        <w:t xml:space="preserve"> ELF đơn giản, các chương trình </w:t>
       </w:r>
       <w:proofErr w:type="spellStart"/>
       <w:r>
@@ -1984,7 +2069,11 @@
         <w:jc w:val="both"/>
       </w:pPr>
       <w:r>
-        <w:t>So với C/C++, Java bất lợi ở chỗ khó tận dụng trực tiếp các thư viện dịch ngược native vốn đã phổ biến trong cộng đồng reverse engineering. Tuy nhiên, với mục tiêu hiện tại là nắm chắc parser, resolver, decoder và mô hình dữ liệu, Java vẫn là lựa chọn cân bằng hơn. Hơn nữa, Java 21 đã cung cấp FFM API theo hướng gọi native library và thao tác native memory thuận tiện hơn JNI truyền thống, vì vậy kiến trúc hiện tại hoàn toàn có thể mở đường cho backend native ở giai đoạn sau [5].</w:t>
+        <w:t xml:space="preserve">So với C/C++, Java bất lợi ở chỗ khó tận dụng trực tiếp các thư viện dịch ngược native vốn đã phổ biến trong cộng đồng reverse engineering. Tuy nhiên, với mục tiêu hiện tại là nắm chắc parser, resolver, decoder và mô hình dữ liệu, Java vẫn là lựa chọn cân bằng hơn. Hơn nữa, Java 21 đã cung cấp FFM API theo hướng gọi native library và </w:t>
+      </w:r>
+      <w:r>
+        <w:lastRenderedPageBreak/>
+        <w:t>thao tác native memory thuận tiện hơn JNI truyền thống, vì vậy kiến trúc hiện tại hoàn toàn có thể mở đường cho backend native ở giai đoạn sau [5].</w:t>
       </w:r>
     </w:p>
     <w:p>
@@ -1994,11 +2083,7 @@
         <w:jc w:val="both"/>
       </w:pPr>
       <w:r>
-        <w:t xml:space="preserve">Từ góc nhìn thiết kế, quyết định hợp lý nhất là: Java được dùng để triển khai lõi học thuật và structured output trong giai đoạn hiện tại; còn khả năng tích hợp Capstone </w:t>
-      </w:r>
-      <w:r>
-        <w:lastRenderedPageBreak/>
-        <w:t>hoặc các thư viện native khác chỉ nên được xem là hướng tối ưu hóa hoặc mở rộng về sau [10].</w:t>
+        <w:t>Từ góc nhìn thiết kế, quyết định hợp lý nhất là: Java được dùng để triển khai lõi học thuật và structured output trong giai đoạn hiện tại; còn khả năng tích hợp Capstone hoặc các thư viện native khác chỉ nên được xem là hướng tối ưu hóa hoặc mở rộng về sau [10].</w:t>
       </w:r>
     </w:p>
     <w:p>
@@ -2368,6 +2453,7 @@
               <w:rPr>
                 <w:sz w:val="25"/>
               </w:rPr>
+              <w:lastRenderedPageBreak/>
               <w:t>Đầu ra</w:t>
             </w:r>
           </w:p>
@@ -2475,7 +2561,6 @@
         <w:spacing w:line="324" w:lineRule="auto"/>
       </w:pPr>
       <w:r>
-        <w:lastRenderedPageBreak/>
         <w:br w:type="page"/>
       </w:r>
     </w:p>
@@ -2594,7 +2679,6 @@
       <w:pPr>
         <w:spacing w:after="80" w:line="324" w:lineRule="auto"/>
         <w:ind w:left="425" w:hanging="425"/>
-        <w:jc w:val="both"/>
       </w:pPr>
       <w:r>
         <w:rPr>
@@ -2607,7 +2691,6 @@
       <w:pPr>
         <w:spacing w:after="80" w:line="324" w:lineRule="auto"/>
         <w:ind w:left="425" w:hanging="425"/>
-        <w:jc w:val="both"/>
       </w:pPr>
       <w:r>
         <w:rPr>
@@ -2620,7 +2703,6 @@
       <w:pPr>
         <w:spacing w:after="80" w:line="324" w:lineRule="auto"/>
         <w:ind w:left="425" w:hanging="425"/>
-        <w:jc w:val="both"/>
       </w:pPr>
       <w:r>
         <w:rPr>
@@ -2633,7 +2715,6 @@
       <w:pPr>
         <w:spacing w:after="80" w:line="324" w:lineRule="auto"/>
         <w:ind w:left="425" w:hanging="425"/>
-        <w:jc w:val="both"/>
       </w:pPr>
       <w:r>
         <w:rPr>
@@ -2646,7 +2727,6 @@
       <w:pPr>
         <w:spacing w:after="80" w:line="324" w:lineRule="auto"/>
         <w:ind w:left="425" w:hanging="425"/>
-        <w:jc w:val="both"/>
       </w:pPr>
       <w:r>
         <w:rPr>
@@ -2659,7 +2739,6 @@
       <w:pPr>
         <w:spacing w:after="80" w:line="324" w:lineRule="auto"/>
         <w:ind w:left="425" w:hanging="425"/>
-        <w:jc w:val="both"/>
       </w:pPr>
       <w:r>
         <w:rPr>
@@ -2672,7 +2751,6 @@
       <w:pPr>
         <w:spacing w:after="80" w:line="324" w:lineRule="auto"/>
         <w:ind w:left="425" w:hanging="425"/>
-        <w:jc w:val="both"/>
       </w:pPr>
       <w:r>
         <w:rPr>
@@ -2685,7 +2763,6 @@
       <w:pPr>
         <w:spacing w:after="80" w:line="324" w:lineRule="auto"/>
         <w:ind w:left="425" w:hanging="425"/>
-        <w:jc w:val="both"/>
       </w:pPr>
       <w:r>
         <w:rPr>
@@ -2698,7 +2775,6 @@
       <w:pPr>
         <w:spacing w:after="80" w:line="324" w:lineRule="auto"/>
         <w:ind w:left="425" w:hanging="425"/>
-        <w:jc w:val="both"/>
       </w:pPr>
       <w:r>
         <w:rPr>
@@ -2711,13 +2787,297 @@
       <w:pPr>
         <w:spacing w:after="80" w:line="324" w:lineRule="auto"/>
         <w:ind w:left="425" w:hanging="425"/>
-        <w:jc w:val="both"/>
-      </w:pPr>
-      <w:r>
         <w:rPr>
           <w:sz w:val="24"/>
+          <w:lang w:val="en-US"/>
+        </w:rPr>
+      </w:pPr>
+      <w:r>
+        <w:rPr>
+          <w:sz w:val="24"/>
         </w:rPr>
         <w:t>[10] Capstone Engine, "Documentation," capstone-engine.org. [Online]. Available: https://www.capstone-engine.org/documentation.html. [Accessed: Mar. 29, 2026].</w:t>
+      </w:r>
+    </w:p>
+    <w:p>
+      <w:pPr>
+        <w:spacing w:after="80" w:line="324" w:lineRule="auto"/>
+        <w:ind w:left="425" w:hanging="425"/>
+        <w:rPr>
+          <w:lang w:val="en-US"/>
+        </w:rPr>
+      </w:pPr>
+      <w:r>
+        <w:rPr>
+          <w:sz w:val="24"/>
+          <w:lang w:val="en-US"/>
+        </w:rPr>
+        <w:t xml:space="preserve">[11] </w:t>
+      </w:r>
+      <w:r>
+        <w:rPr>
+          <w:sz w:val="24"/>
+        </w:rPr>
+        <w:t xml:space="preserve">N. </w:t>
+      </w:r>
+      <w:proofErr w:type="spellStart"/>
+      <w:r>
+        <w:rPr>
+          <w:sz w:val="24"/>
+        </w:rPr>
+        <w:t>Jones</w:t>
+      </w:r>
+      <w:proofErr w:type="spellEnd"/>
+      <w:r>
+        <w:rPr>
+          <w:sz w:val="24"/>
+        </w:rPr>
+        <w:t>, "</w:t>
+      </w:r>
+      <w:proofErr w:type="spellStart"/>
+      <w:r>
+        <w:rPr>
+          <w:sz w:val="24"/>
+        </w:rPr>
+        <w:t>How</w:t>
+      </w:r>
+      <w:proofErr w:type="spellEnd"/>
+      <w:r>
+        <w:rPr>
+          <w:sz w:val="24"/>
+        </w:rPr>
+        <w:t xml:space="preserve"> to </w:t>
+      </w:r>
+      <w:proofErr w:type="spellStart"/>
+      <w:r>
+        <w:rPr>
+          <w:sz w:val="24"/>
+        </w:rPr>
+        <w:t>Create</w:t>
+      </w:r>
+      <w:proofErr w:type="spellEnd"/>
+      <w:r>
+        <w:rPr>
+          <w:sz w:val="24"/>
+        </w:rPr>
+        <w:t xml:space="preserve"> </w:t>
+      </w:r>
+      <w:proofErr w:type="spellStart"/>
+      <w:r>
+        <w:rPr>
+          <w:sz w:val="24"/>
+        </w:rPr>
+        <w:t>Jump</w:t>
+      </w:r>
+      <w:proofErr w:type="spellEnd"/>
+      <w:r>
+        <w:rPr>
+          <w:sz w:val="24"/>
+        </w:rPr>
+        <w:t xml:space="preserve"> </w:t>
+      </w:r>
+      <w:proofErr w:type="spellStart"/>
+      <w:r>
+        <w:rPr>
+          <w:sz w:val="24"/>
+        </w:rPr>
+        <w:t>Tables</w:t>
+      </w:r>
+      <w:proofErr w:type="spellEnd"/>
+      <w:r>
+        <w:rPr>
+          <w:sz w:val="24"/>
+        </w:rPr>
+        <w:t xml:space="preserve"> </w:t>
+      </w:r>
+      <w:proofErr w:type="spellStart"/>
+      <w:r>
+        <w:rPr>
+          <w:sz w:val="24"/>
+        </w:rPr>
+        <w:t>via</w:t>
+      </w:r>
+      <w:proofErr w:type="spellEnd"/>
+      <w:r>
+        <w:rPr>
+          <w:sz w:val="24"/>
+        </w:rPr>
+        <w:t xml:space="preserve"> </w:t>
+      </w:r>
+      <w:proofErr w:type="spellStart"/>
+      <w:r>
+        <w:rPr>
+          <w:sz w:val="24"/>
+        </w:rPr>
+        <w:t>Function</w:t>
+      </w:r>
+      <w:proofErr w:type="spellEnd"/>
+      <w:r>
+        <w:rPr>
+          <w:sz w:val="24"/>
+        </w:rPr>
+        <w:t xml:space="preserve"> </w:t>
+      </w:r>
+      <w:proofErr w:type="spellStart"/>
+      <w:r>
+        <w:rPr>
+          <w:sz w:val="24"/>
+        </w:rPr>
+        <w:t>Pointer</w:t>
+      </w:r>
+      <w:proofErr w:type="spellEnd"/>
+      <w:r>
+        <w:rPr>
+          <w:sz w:val="24"/>
+        </w:rPr>
+        <w:t xml:space="preserve"> </w:t>
+      </w:r>
+      <w:proofErr w:type="spellStart"/>
+      <w:r>
+        <w:rPr>
+          <w:sz w:val="24"/>
+        </w:rPr>
+        <w:t>Arrays</w:t>
+      </w:r>
+      <w:proofErr w:type="spellEnd"/>
+      <w:r>
+        <w:rPr>
+          <w:sz w:val="24"/>
+        </w:rPr>
+        <w:t xml:space="preserve"> in C </w:t>
+      </w:r>
+      <w:proofErr w:type="spellStart"/>
+      <w:r>
+        <w:rPr>
+          <w:sz w:val="24"/>
+        </w:rPr>
+        <w:t>and</w:t>
+      </w:r>
+      <w:proofErr w:type="spellEnd"/>
+      <w:r>
+        <w:rPr>
+          <w:sz w:val="24"/>
+        </w:rPr>
+        <w:t xml:space="preserve"> C++," </w:t>
+      </w:r>
+      <w:proofErr w:type="spellStart"/>
+      <w:r>
+        <w:rPr>
+          <w:i/>
+          <w:iCs/>
+          <w:sz w:val="24"/>
+        </w:rPr>
+        <w:t>Netrino</w:t>
+      </w:r>
+      <w:proofErr w:type="spellEnd"/>
+      <w:r>
+        <w:rPr>
+          <w:sz w:val="24"/>
+        </w:rPr>
+        <w:t>, May 1999. [</w:t>
+      </w:r>
+      <w:proofErr w:type="spellStart"/>
+      <w:r>
+        <w:rPr>
+          <w:sz w:val="24"/>
+        </w:rPr>
+        <w:t>Online</w:t>
+      </w:r>
+      <w:proofErr w:type="spellEnd"/>
+      <w:r>
+        <w:rPr>
+          <w:sz w:val="24"/>
+        </w:rPr>
+        <w:t xml:space="preserve">]. </w:t>
+      </w:r>
+      <w:proofErr w:type="spellStart"/>
+      <w:r>
+        <w:rPr>
+          <w:sz w:val="24"/>
+        </w:rPr>
+        <w:t>Available</w:t>
+      </w:r>
+      <w:proofErr w:type="spellEnd"/>
+      <w:r>
+        <w:rPr>
+          <w:sz w:val="24"/>
+        </w:rPr>
+        <w:t xml:space="preserve">: </w:t>
+      </w:r>
+      <w:hyperlink w:tgtFrame="_blank" w:history="1">
+        <w:r>
+          <w:rPr>
+            <w:rStyle w:val="Hyperlink"/>
+            <w:sz w:val="24"/>
+          </w:rPr>
+          <w:t>https://web.archive.org/web/20120212110151/http://www.netrino.com/node/137</w:t>
+        </w:r>
+      </w:hyperlink>
+      <w:r>
+        <w:rPr>
+          <w:sz w:val="24"/>
+        </w:rPr>
+        <w:t>.</w:t>
+      </w:r>
+      <w:r>
+        <w:rPr>
+          <w:sz w:val="24"/>
+          <w:lang w:val="en-US"/>
+        </w:rPr>
+        <w:t xml:space="preserve"> </w:t>
+      </w:r>
+      <w:r>
+        <w:rPr>
+          <w:sz w:val="24"/>
+        </w:rPr>
+        <w:t>[</w:t>
+      </w:r>
+      <w:proofErr w:type="spellStart"/>
+      <w:r>
+        <w:rPr>
+          <w:sz w:val="24"/>
+        </w:rPr>
+        <w:t>Accessed</w:t>
+      </w:r>
+      <w:proofErr w:type="spellEnd"/>
+      <w:r>
+        <w:rPr>
+          <w:sz w:val="24"/>
+        </w:rPr>
+        <w:t xml:space="preserve">: </w:t>
+      </w:r>
+      <w:r>
+        <w:rPr>
+          <w:sz w:val="24"/>
+          <w:lang w:val="en-US"/>
+        </w:rPr>
+        <w:t>May</w:t>
+      </w:r>
+      <w:r>
+        <w:rPr>
+          <w:sz w:val="24"/>
+        </w:rPr>
+        <w:t xml:space="preserve">. </w:t>
+      </w:r>
+      <w:r>
+        <w:rPr>
+          <w:sz w:val="24"/>
+          <w:lang w:val="en-US"/>
+        </w:rPr>
+        <w:t>07</w:t>
+      </w:r>
+      <w:r>
+        <w:rPr>
+          <w:sz w:val="24"/>
+        </w:rPr>
+        <w:t>, 2026]</w:t>
+      </w:r>
+      <w:r>
+        <w:rPr>
+          <w:sz w:val="24"/>
+          <w:lang w:val="en-US"/>
+        </w:rPr>
+        <w:t xml:space="preserve">. </w:t>
       </w:r>
     </w:p>
     <w:sectPr>
@@ -3125,11 +3485,10 @@
   <w:abstractNum w:abstractNumId="1" w15:restartNumberingAfterBreak="0">
     <w:nsid w:val="02BA4D81"/>
     <w:multiLevelType w:val="hybridMultilevel"/>
-    <w:tmpl w:val="27DA2198"/>
+    <w:tmpl w:val="5F162C3C"/>
     <w:lvl w:ilvl="0" w:tplc="219E1390">
       <w:start w:val="1"/>
       <w:numFmt w:val="decimal"/>
-      <w:pStyle w:val="Heading2"/>
       <w:lvlText w:val="%1."/>
       <w:lvlJc w:val="left"/>
       <w:pPr>
@@ -3842,6 +4201,124 @@
     </w:lvl>
   </w:abstractNum>
   <w:abstractNum w:abstractNumId="7" w15:restartNumberingAfterBreak="0">
+    <w:nsid w:val="1B6A66C9"/>
+    <w:multiLevelType w:val="multilevel"/>
+    <w:tmpl w:val="B372AADA"/>
+    <w:lvl w:ilvl="0">
+      <w:start w:val="1"/>
+      <w:numFmt w:val="decimal"/>
+      <w:pStyle w:val="Heading1"/>
+      <w:lvlText w:val="Chương %1: "/>
+      <w:lvlJc w:val="left"/>
+      <w:pPr>
+        <w:ind w:left="360" w:hanging="360"/>
+      </w:pPr>
+      <w:rPr>
+        <w:rFonts w:hint="default"/>
+      </w:rPr>
+    </w:lvl>
+    <w:lvl w:ilvl="1">
+      <w:start w:val="1"/>
+      <w:numFmt w:val="decimal"/>
+      <w:pStyle w:val="Heading2"/>
+      <w:lvlText w:val="%1.%2."/>
+      <w:lvlJc w:val="left"/>
+      <w:pPr>
+        <w:ind w:left="720" w:hanging="360"/>
+      </w:pPr>
+      <w:rPr>
+        <w:rFonts w:hint="default"/>
+      </w:rPr>
+    </w:lvl>
+    <w:lvl w:ilvl="2">
+      <w:start w:val="1"/>
+      <w:numFmt w:val="decimal"/>
+      <w:pStyle w:val="Heading3"/>
+      <w:lvlText w:val="%1.%2.%3."/>
+      <w:lvlJc w:val="left"/>
+      <w:pPr>
+        <w:ind w:left="1080" w:hanging="360"/>
+      </w:pPr>
+      <w:rPr>
+        <w:rFonts w:hint="default"/>
+      </w:rPr>
+    </w:lvl>
+    <w:lvl w:ilvl="3">
+      <w:start w:val="1"/>
+      <w:numFmt w:val="decimal"/>
+      <w:pStyle w:val="Heading4"/>
+      <w:lvlText w:val="%1.%2.%3.%4."/>
+      <w:lvlJc w:val="left"/>
+      <w:pPr>
+        <w:ind w:left="1440" w:hanging="360"/>
+      </w:pPr>
+      <w:rPr>
+        <w:rFonts w:hint="default"/>
+      </w:rPr>
+    </w:lvl>
+    <w:lvl w:ilvl="4">
+      <w:start w:val="1"/>
+      <w:numFmt w:val="decimal"/>
+      <w:pStyle w:val="Heading5"/>
+      <w:lvlText w:val="%1.%2.%3.%4.%5."/>
+      <w:lvlJc w:val="left"/>
+      <w:pPr>
+        <w:ind w:left="1800" w:hanging="360"/>
+      </w:pPr>
+      <w:rPr>
+        <w:rFonts w:hint="default"/>
+      </w:rPr>
+    </w:lvl>
+    <w:lvl w:ilvl="5">
+      <w:start w:val="1"/>
+      <w:numFmt w:val="upperRoman"/>
+      <w:lvlText w:val="%6"/>
+      <w:lvlJc w:val="left"/>
+      <w:pPr>
+        <w:ind w:left="2160" w:hanging="360"/>
+      </w:pPr>
+      <w:rPr>
+        <w:rFonts w:hint="default"/>
+      </w:rPr>
+    </w:lvl>
+    <w:lvl w:ilvl="6">
+      <w:start w:val="1"/>
+      <w:numFmt w:val="decimal"/>
+      <w:lvlText w:val="%7."/>
+      <w:lvlJc w:val="left"/>
+      <w:pPr>
+        <w:ind w:left="2520" w:hanging="360"/>
+      </w:pPr>
+      <w:rPr>
+        <w:rFonts w:hint="default"/>
+      </w:rPr>
+    </w:lvl>
+    <w:lvl w:ilvl="7">
+      <w:start w:val="1"/>
+      <w:numFmt w:val="lowerLetter"/>
+      <w:lvlText w:val="%8."/>
+      <w:lvlJc w:val="left"/>
+      <w:pPr>
+        <w:ind w:left="2880" w:hanging="360"/>
+      </w:pPr>
+      <w:rPr>
+        <w:rFonts w:hint="default"/>
+      </w:rPr>
+    </w:lvl>
+    <w:lvl w:ilvl="8">
+      <w:start w:val="1"/>
+      <w:numFmt w:val="lowerRoman"/>
+      <w:lvlText w:val="%9."/>
+      <w:lvlJc w:val="left"/>
+      <w:pPr>
+        <w:ind w:left="3240" w:hanging="360"/>
+      </w:pPr>
+      <w:rPr>
+        <w:rFonts w:hint="default"/>
+      </w:rPr>
+    </w:lvl>
+  </w:abstractNum>
+  <w:abstractNum w:abstractNumId="8" w15:restartNumberingAfterBreak="0">
     <w:nsid w:val="24E94A92"/>
     <w:multiLevelType w:val="multilevel"/>
     <w:tmpl w:val="EB7CBB8A"/>
@@ -3954,7 +4431,7 @@
       </w:pPr>
     </w:lvl>
   </w:abstractNum>
-  <w:abstractNum w:abstractNumId="8" w15:restartNumberingAfterBreak="0">
+  <w:abstractNum w:abstractNumId="9" w15:restartNumberingAfterBreak="0">
     <w:nsid w:val="25D218E0"/>
     <w:multiLevelType w:val="hybridMultilevel"/>
     <w:tmpl w:val="DCE4C23E"/>
@@ -4067,7 +4544,7 @@
       </w:rPr>
     </w:lvl>
   </w:abstractNum>
-  <w:abstractNum w:abstractNumId="9" w15:restartNumberingAfterBreak="0">
+  <w:abstractNum w:abstractNumId="10" w15:restartNumberingAfterBreak="0">
     <w:nsid w:val="2EC15FBE"/>
     <w:multiLevelType w:val="multilevel"/>
     <w:tmpl w:val="8B5CAE88"/>
@@ -4189,7 +4666,7 @@
       </w:rPr>
     </w:lvl>
   </w:abstractNum>
-  <w:abstractNum w:abstractNumId="10" w15:restartNumberingAfterBreak="0">
+  <w:abstractNum w:abstractNumId="11" w15:restartNumberingAfterBreak="0">
     <w:nsid w:val="31F53D3C"/>
     <w:multiLevelType w:val="multilevel"/>
     <w:tmpl w:val="BE10E5CE"/>
@@ -4302,7 +4779,7 @@
       </w:pPr>
     </w:lvl>
   </w:abstractNum>
-  <w:abstractNum w:abstractNumId="11" w15:restartNumberingAfterBreak="0">
+  <w:abstractNum w:abstractNumId="12" w15:restartNumberingAfterBreak="0">
     <w:nsid w:val="3B240FAA"/>
     <w:multiLevelType w:val="multilevel"/>
     <w:tmpl w:val="EB7463D2"/>
@@ -4447,7 +4924,7 @@
       </w:rPr>
     </w:lvl>
   </w:abstractNum>
-  <w:abstractNum w:abstractNumId="12" w15:restartNumberingAfterBreak="0">
+  <w:abstractNum w:abstractNumId="13" w15:restartNumberingAfterBreak="0">
     <w:nsid w:val="3D78713D"/>
     <w:multiLevelType w:val="hybridMultilevel"/>
     <w:tmpl w:val="4FD2930E"/>
@@ -4560,7 +5037,7 @@
       </w:rPr>
     </w:lvl>
   </w:abstractNum>
-  <w:abstractNum w:abstractNumId="13" w15:restartNumberingAfterBreak="0">
+  <w:abstractNum w:abstractNumId="14" w15:restartNumberingAfterBreak="0">
     <w:nsid w:val="4D0F7C7B"/>
     <w:multiLevelType w:val="hybridMultilevel"/>
     <w:tmpl w:val="421A5336"/>
@@ -4649,7 +5126,7 @@
       </w:pPr>
     </w:lvl>
   </w:abstractNum>
-  <w:abstractNum w:abstractNumId="14" w15:restartNumberingAfterBreak="0">
+  <w:abstractNum w:abstractNumId="15" w15:restartNumberingAfterBreak="0">
     <w:nsid w:val="5AEB3A85"/>
     <w:multiLevelType w:val="multilevel"/>
     <w:tmpl w:val="29921EF8"/>
@@ -4770,7 +5247,7 @@
       </w:rPr>
     </w:lvl>
   </w:abstractNum>
-  <w:abstractNum w:abstractNumId="15" w15:restartNumberingAfterBreak="0">
+  <w:abstractNum w:abstractNumId="16" w15:restartNumberingAfterBreak="0">
     <w:nsid w:val="610E233F"/>
     <w:multiLevelType w:val="multilevel"/>
     <w:tmpl w:val="CF1CE01E"/>
@@ -4919,7 +5396,7 @@
       </w:rPr>
     </w:lvl>
   </w:abstractNum>
-  <w:abstractNum w:abstractNumId="16" w15:restartNumberingAfterBreak="0">
+  <w:abstractNum w:abstractNumId="17" w15:restartNumberingAfterBreak="0">
     <w:nsid w:val="647703B1"/>
     <w:multiLevelType w:val="multilevel"/>
     <w:tmpl w:val="73B68384"/>
@@ -5068,14 +5545,13 @@
       </w:rPr>
     </w:lvl>
   </w:abstractNum>
-  <w:abstractNum w:abstractNumId="17" w15:restartNumberingAfterBreak="0">
+  <w:abstractNum w:abstractNumId="18" w15:restartNumberingAfterBreak="0">
     <w:nsid w:val="69DE4086"/>
     <w:multiLevelType w:val="hybridMultilevel"/>
-    <w:tmpl w:val="1D9EA594"/>
-    <w:lvl w:ilvl="0" w:tplc="D182E638">
-      <w:start w:val="1"/>
-      <w:numFmt w:val="decimal"/>
-      <w:pStyle w:val="uchng"/>
+    <w:tmpl w:val="9C387E02"/>
+    <w:lvl w:ilvl="0" w:tplc="B2141656">
+      <w:start w:val="1"/>
+      <w:numFmt w:val="decimal"/>
       <w:lvlText w:val="Chương %1:"/>
       <w:lvlJc w:val="center"/>
       <w:pPr>
@@ -5158,7 +5634,7 @@
       </w:pPr>
     </w:lvl>
   </w:abstractNum>
-  <w:abstractNum w:abstractNumId="18" w15:restartNumberingAfterBreak="0">
+  <w:abstractNum w:abstractNumId="19" w15:restartNumberingAfterBreak="0">
     <w:nsid w:val="6E481323"/>
     <w:multiLevelType w:val="multilevel"/>
     <w:tmpl w:val="0409001F"/>
@@ -5244,10 +5720,10 @@
       </w:pPr>
     </w:lvl>
   </w:abstractNum>
-  <w:abstractNum w:abstractNumId="19" w15:restartNumberingAfterBreak="0">
+  <w:abstractNum w:abstractNumId="20" w15:restartNumberingAfterBreak="0">
     <w:nsid w:val="719A7419"/>
     <w:multiLevelType w:val="multilevel"/>
-    <w:tmpl w:val="F7AAC136"/>
+    <w:tmpl w:val="3FE21540"/>
     <w:lvl w:ilvl="0">
       <w:start w:val="1"/>
       <w:numFmt w:val="decimal"/>
@@ -5272,7 +5748,6 @@
     <w:lvl w:ilvl="2">
       <w:start w:val="1"/>
       <w:numFmt w:val="decimal"/>
-      <w:pStyle w:val="Heading3"/>
       <w:lvlText w:val="%1.%2.%3"/>
       <w:lvlJc w:val="left"/>
       <w:pPr>
@@ -5352,7 +5827,7 @@
       </w:rPr>
     </w:lvl>
   </w:abstractNum>
-  <w:abstractNum w:abstractNumId="20" w15:restartNumberingAfterBreak="0">
+  <w:abstractNum w:abstractNumId="21" w15:restartNumberingAfterBreak="0">
     <w:nsid w:val="7A6C4285"/>
     <w:multiLevelType w:val="hybridMultilevel"/>
     <w:tmpl w:val="0B40E4A2"/>
@@ -5441,7 +5916,7 @@
       </w:pPr>
     </w:lvl>
   </w:abstractNum>
-  <w:abstractNum w:abstractNumId="21" w15:restartNumberingAfterBreak="0">
+  <w:abstractNum w:abstractNumId="22" w15:restartNumberingAfterBreak="0">
     <w:nsid w:val="7AB67B0A"/>
     <w:multiLevelType w:val="multilevel"/>
     <w:tmpl w:val="0409001F"/>
@@ -5530,14 +6005,13 @@
       </w:pPr>
     </w:lvl>
   </w:abstractNum>
-  <w:abstractNum w:abstractNumId="22" w15:restartNumberingAfterBreak="0">
+  <w:abstractNum w:abstractNumId="23" w15:restartNumberingAfterBreak="0">
     <w:nsid w:val="7D0F6C52"/>
     <w:multiLevelType w:val="multilevel"/>
-    <w:tmpl w:val="08168720"/>
+    <w:tmpl w:val="F8C8AD9A"/>
     <w:lvl w:ilvl="0">
       <w:start w:val="1"/>
       <w:numFmt w:val="decimal"/>
-      <w:pStyle w:val="Heading1"/>
       <w:lvlText w:val="CHƯƠNG %1."/>
       <w:lvlJc w:val="left"/>
       <w:pPr>
@@ -5675,7 +6149,7 @@
       </w:rPr>
     </w:lvl>
   </w:abstractNum>
-  <w:abstractNum w:abstractNumId="23" w15:restartNumberingAfterBreak="0">
+  <w:abstractNum w:abstractNumId="24" w15:restartNumberingAfterBreak="0">
     <w:nsid w:val="7EDA4FCD"/>
     <w:multiLevelType w:val="multilevel"/>
     <w:tmpl w:val="51B87F3A"/>
@@ -5825,52 +6299,52 @@
     </w:lvl>
   </w:abstractNum>
   <w:num w:numId="1" w16cid:durableId="1983580835">
-    <w:abstractNumId w:val="22"/>
+    <w:abstractNumId w:val="23"/>
   </w:num>
   <w:num w:numId="2" w16cid:durableId="1995647049">
-    <w:abstractNumId w:val="16"/>
+    <w:abstractNumId w:val="17"/>
   </w:num>
   <w:num w:numId="3" w16cid:durableId="2118599545">
-    <w:abstractNumId w:val="9"/>
+    <w:abstractNumId w:val="10"/>
   </w:num>
   <w:num w:numId="4" w16cid:durableId="818423900">
     <w:abstractNumId w:val="5"/>
   </w:num>
   <w:num w:numId="5" w16cid:durableId="643508223">
-    <w:abstractNumId w:val="14"/>
+    <w:abstractNumId w:val="15"/>
   </w:num>
   <w:num w:numId="6" w16cid:durableId="1012759593">
-    <w:abstractNumId w:val="8"/>
+    <w:abstractNumId w:val="9"/>
   </w:num>
   <w:num w:numId="7" w16cid:durableId="1015113204">
-    <w:abstractNumId w:val="11"/>
+    <w:abstractNumId w:val="12"/>
   </w:num>
   <w:num w:numId="8" w16cid:durableId="543760551">
     <w:abstractNumId w:val="3"/>
   </w:num>
   <w:num w:numId="9" w16cid:durableId="1334144115">
-    <w:abstractNumId w:val="12"/>
+    <w:abstractNumId w:val="13"/>
   </w:num>
   <w:num w:numId="10" w16cid:durableId="727529542">
-    <w:abstractNumId w:val="14"/>
+    <w:abstractNumId w:val="15"/>
   </w:num>
   <w:num w:numId="11" w16cid:durableId="1022442453">
-    <w:abstractNumId w:val="20"/>
+    <w:abstractNumId w:val="21"/>
   </w:num>
   <w:num w:numId="12" w16cid:durableId="1763337171">
-    <w:abstractNumId w:val="17"/>
+    <w:abstractNumId w:val="18"/>
   </w:num>
   <w:num w:numId="13" w16cid:durableId="1181630024">
-    <w:abstractNumId w:val="10"/>
+    <w:abstractNumId w:val="11"/>
   </w:num>
   <w:num w:numId="14" w16cid:durableId="1004434897">
     <w:abstractNumId w:val="2"/>
   </w:num>
   <w:num w:numId="15" w16cid:durableId="310213960">
-    <w:abstractNumId w:val="7"/>
+    <w:abstractNumId w:val="8"/>
   </w:num>
   <w:num w:numId="16" w16cid:durableId="1340280867">
-    <w:abstractNumId w:val="14"/>
+    <w:abstractNumId w:val="15"/>
     <w:lvlOverride w:ilvl="0">
       <w:startOverride w:val="1"/>
     </w:lvlOverride>
@@ -5900,28 +6374,28 @@
     </w:lvlOverride>
   </w:num>
   <w:num w:numId="17" w16cid:durableId="1651907414">
-    <w:abstractNumId w:val="21"/>
+    <w:abstractNumId w:val="22"/>
   </w:num>
   <w:num w:numId="18" w16cid:durableId="210382914">
-    <w:abstractNumId w:val="21"/>
+    <w:abstractNumId w:val="22"/>
     <w:lvlOverride w:ilvl="0">
       <w:startOverride w:val="1"/>
     </w:lvlOverride>
   </w:num>
   <w:num w:numId="19" w16cid:durableId="735930146">
-    <w:abstractNumId w:val="13"/>
+    <w:abstractNumId w:val="14"/>
   </w:num>
   <w:num w:numId="20" w16cid:durableId="649948399">
-    <w:abstractNumId w:val="13"/>
+    <w:abstractNumId w:val="14"/>
     <w:lvlOverride w:ilvl="0">
       <w:startOverride w:val="1"/>
     </w:lvlOverride>
   </w:num>
   <w:num w:numId="21" w16cid:durableId="1865361533">
-    <w:abstractNumId w:val="18"/>
+    <w:abstractNumId w:val="19"/>
   </w:num>
   <w:num w:numId="22" w16cid:durableId="271279256">
-    <w:abstractNumId w:val="19"/>
+    <w:abstractNumId w:val="20"/>
   </w:num>
   <w:num w:numId="23" w16cid:durableId="457063863">
     <w:abstractNumId w:val="1"/>
@@ -5933,7 +6407,7 @@
     <w:abstractNumId w:val="6"/>
   </w:num>
   <w:num w:numId="26" w16cid:durableId="172106877">
-    <w:abstractNumId w:val="9"/>
+    <w:abstractNumId w:val="10"/>
     <w:lvlOverride w:ilvl="0">
       <w:startOverride w:val="1"/>
     </w:lvlOverride>
@@ -5963,7 +6437,7 @@
     </w:lvlOverride>
   </w:num>
   <w:num w:numId="27" w16cid:durableId="433598648">
-    <w:abstractNumId w:val="19"/>
+    <w:abstractNumId w:val="20"/>
     <w:lvlOverride w:ilvl="0">
       <w:startOverride w:val="1"/>
     </w:lvlOverride>
@@ -5996,10 +6470,13 @@
     <w:abstractNumId w:val="0"/>
   </w:num>
   <w:num w:numId="29" w16cid:durableId="954213204">
-    <w:abstractNumId w:val="15"/>
+    <w:abstractNumId w:val="16"/>
   </w:num>
   <w:num w:numId="30" w16cid:durableId="867527229">
-    <w:abstractNumId w:val="23"/>
+    <w:abstractNumId w:val="24"/>
+  </w:num>
+  <w:num w:numId="31" w16cid:durableId="158889081">
+    <w:abstractNumId w:val="7"/>
   </w:num>
   <w:numIdMacAtCleanup w:val="12"/>
 </w:numbering>
@@ -6322,10 +6799,9 @@
     <w:pPr>
       <w:keepNext/>
       <w:numPr>
-        <w:numId w:val="1"/>
+        <w:numId w:val="31"/>
       </w:numPr>
       <w:spacing w:before="480" w:after="480"/>
-      <w:ind w:hanging="1080"/>
       <w:jc w:val="center"/>
       <w:outlineLvl w:val="0"/>
     </w:pPr>
@@ -6346,13 +6822,13 @@
     <w:pPr>
       <w:keepNext/>
       <w:numPr>
-        <w:numId w:val="23"/>
+        <w:ilvl w:val="1"/>
+        <w:numId w:val="31"/>
       </w:numPr>
       <w:tabs>
         <w:tab w:val="left" w:pos="360"/>
       </w:tabs>
       <w:spacing w:after="240"/>
-      <w:ind w:left="270" w:hanging="270"/>
       <w:jc w:val="both"/>
       <w:outlineLvl w:val="1"/>
     </w:pPr>
@@ -6373,7 +6849,6 @@
     <w:pPr>
       <w:numPr>
         <w:ilvl w:val="2"/>
-        <w:numId w:val="22"/>
       </w:numPr>
       <w:spacing w:before="240"/>
       <w:outlineLvl w:val="2"/>
@@ -6390,6 +6865,9 @@
     <w:qFormat/>
     <w:rsid w:val="004D18B4"/>
     <w:pPr>
+      <w:numPr>
+        <w:ilvl w:val="3"/>
+      </w:numPr>
       <w:outlineLvl w:val="3"/>
     </w:pPr>
   </w:style>
@@ -6401,6 +6879,10 @@
     <w:rsid w:val="00110394"/>
     <w:pPr>
       <w:keepNext/>
+      <w:numPr>
+        <w:ilvl w:val="4"/>
+        <w:numId w:val="31"/>
+      </w:numPr>
       <w:tabs>
         <w:tab w:val="left" w:pos="2625"/>
       </w:tabs>
@@ -6845,12 +7327,13 @@
     <w:link w:val="uchngChar"/>
     <w:autoRedefine/>
     <w:qFormat/>
-    <w:rsid w:val="0044726D"/>
+    <w:rsid w:val="002A2668"/>
     <w:pPr>
+      <w:pageBreakBefore/>
       <w:numPr>
-        <w:numId w:val="12"/>
+        <w:numId w:val="0"/>
       </w:numPr>
-      <w:spacing w:before="360" w:after="360"/>
+      <w:spacing w:before="120" w:after="120"/>
     </w:pPr>
     <w:rPr>
       <w:sz w:val="36"/>
@@ -6875,7 +7358,7 @@
     <w:name w:val="Đầu chương Char"/>
     <w:basedOn w:val="Heading1Char"/>
     <w:link w:val="uchng"/>
-    <w:rsid w:val="0044726D"/>
+    <w:rsid w:val="002A2668"/>
     <w:rPr>
       <w:rFonts w:ascii="Arial" w:hAnsi="Arial"/>
       <w:b/>
@@ -7292,12 +7775,7 @@
 </file>
 
 <file path=customXml/item1.xml><?xml version="1.0" encoding="utf-8"?>
-<?mso-contentType ?>
-<FormTemplates xmlns="http://schemas.microsoft.com/sharepoint/v3/contenttype/forms">
-  <Display>DocumentLibraryForm</Display>
-  <Edit>DocumentLibraryForm</Edit>
-  <New>DocumentLibraryForm</New>
-</FormTemplates>
+<b:Sources xmlns:b="http://schemas.openxmlformats.org/officeDocument/2006/bibliography" xmlns="http://schemas.openxmlformats.org/officeDocument/2006/bibliography" SelectedStyle="\APA.XSL" StyleName="APA"/>
 </file>
 
 <file path=customXml/item2.xml><?xml version="1.0" encoding="utf-8"?>
@@ -7309,7 +7787,12 @@
 </file>
 
 <file path=customXml/item3.xml><?xml version="1.0" encoding="utf-8"?>
-<b:Sources xmlns:b="http://schemas.openxmlformats.org/officeDocument/2006/bibliography" xmlns="http://schemas.openxmlformats.org/officeDocument/2006/bibliography" SelectedStyle="\APA.XSL" StyleName="APA"/>
+<?mso-contentType ?>
+<FormTemplates xmlns="http://schemas.microsoft.com/sharepoint/v3/contenttype/forms">
+  <Display>DocumentLibraryForm</Display>
+  <Edit>DocumentLibraryForm</Edit>
+  <New>DocumentLibraryForm</New>
+</FormTemplates>
 </file>
 
 <file path=customXml/item4.xml><?xml version="1.0" encoding="utf-8"?>
@@ -7439,9 +7922,9 @@
 </file>
 
 <file path=customXml/itemProps1.xml><?xml version="1.0" encoding="utf-8"?>
-<ds:datastoreItem xmlns:ds="http://schemas.openxmlformats.org/officeDocument/2006/customXml" ds:itemID="{8A45747E-E7C4-4D46-B469-B576C403C6B7}">
+<ds:datastoreItem xmlns:ds="http://schemas.openxmlformats.org/officeDocument/2006/customXml" ds:itemID="{AFE0CC8A-8F79-44BD-ABAC-2B07631A8785}">
   <ds:schemaRefs>
-    <ds:schemaRef ds:uri="http://schemas.microsoft.com/sharepoint/v3/contenttype/forms"/>
+    <ds:schemaRef ds:uri="http://schemas.openxmlformats.org/officeDocument/2006/bibliography"/>
   </ds:schemaRefs>
 </ds:datastoreItem>
 </file>
@@ -7457,9 +7940,9 @@
 </file>
 
 <file path=customXml/itemProps3.xml><?xml version="1.0" encoding="utf-8"?>
-<ds:datastoreItem xmlns:ds="http://schemas.openxmlformats.org/officeDocument/2006/customXml" ds:itemID="{AFE0CC8A-8F79-44BD-ABAC-2B07631A8785}">
+<ds:datastoreItem xmlns:ds="http://schemas.openxmlformats.org/officeDocument/2006/customXml" ds:itemID="{8A45747E-E7C4-4D46-B469-B576C403C6B7}">
   <ds:schemaRefs>
-    <ds:schemaRef ds:uri="http://schemas.openxmlformats.org/officeDocument/2006/bibliography"/>
+    <ds:schemaRef ds:uri="http://schemas.microsoft.com/sharepoint/v3/contenttype/forms"/>
   </ds:schemaRefs>
 </ds:datastoreItem>
 </file>

</xml_diff>